<commit_message>
Update docs to reflect backend-routed architecture
- ARCHITECTURE.md: updated system diagram (no more direct Supabase
  queries from frontend), added all 18 data endpoints to API table,
  added data flow section explaining JWT-based backend routing,
  updated RLS note about defense-in-depth
- API.md: added full documentation for all data endpoints with
  request/response formats, updated frontend API functions table
- Regenerated all 4 DOCX files

Co-Authored-By: Claude Opus 4.6 (1M context) <noreply@anthropic.com>
</commit_message>
<xml_diff>
--- a/docs/SpendGuard - API Reference.docx
+++ b/docs/SpendGuard - API Reference.docx
@@ -2867,26 +2867,206 @@
           <w:b/>
           <w:bCs/>
         </w:rPr>
-        <w:t xml:space="preserve">Frontend Supabase Queries</w:t>
-      </w:r>
-    </w:p>
-    <w:p>
-      <w:pPr>
-        <w:spacing w:after="120"/>
-      </w:pPr>
-      <w:r>
-        <w:rPr>
-          <w:rFonts w:ascii="Calibri" w:cs="Calibri" w:eastAsia="Calibri" w:hAnsi="Calibri"/>
-          <w:sz w:val="20"/>
-          <w:szCs w:val="20"/>
-        </w:rPr>
-        <w:t xml:space="preserve">The frontend queries Supabase directly (protected by RLS). Key functions in</w:t>
-      </w:r>
-    </w:p>
-    <w:p>
-      <w:pPr>
-        <w:spacing w:after="120"/>
-      </w:pPr>
+        <w:t xml:space="preserve">Data Endpoints</w:t>
+      </w:r>
+    </w:p>
+    <w:p>
+      <w:pPr>
+        <w:spacing w:after="120"/>
+      </w:pPr>
+      <w:r>
+        <w:rPr>
+          <w:rFonts w:ascii="Calibri" w:cs="Calibri" w:eastAsia="Calibri" w:hAnsi="Calibri"/>
+          <w:sz w:val="20"/>
+          <w:szCs w:val="20"/>
+        </w:rPr>
+        <w:t xml:space="preserve">All frontend data queries route through the backend. The frontend never queries</w:t>
+      </w:r>
+    </w:p>
+    <w:p>
+      <w:pPr>
+        <w:spacing w:after="120"/>
+      </w:pPr>
+      <w:r>
+        <w:rPr>
+          <w:rFonts w:ascii="Calibri" w:cs="Calibri" w:eastAsia="Calibri" w:hAnsi="Calibri"/>
+          <w:sz w:val="20"/>
+          <w:szCs w:val="20"/>
+        </w:rPr>
+        <w:t xml:space="preserve">the database directly. Each endpoint verifies the JWT, checks role, and</w:t>
+      </w:r>
+    </w:p>
+    <w:p>
+      <w:pPr>
+        <w:spacing w:after="120"/>
+      </w:pPr>
+      <w:r>
+        <w:rPr>
+          <w:rFonts w:ascii="Calibri" w:cs="Calibri" w:eastAsia="Calibri" w:hAnsi="Calibri"/>
+          <w:sz w:val="20"/>
+          <w:szCs w:val="20"/>
+        </w:rPr>
+        <w:t xml:space="preserve">enforces workspace access.</w:t>
+      </w:r>
+    </w:p>
+    <w:p>
+      <w:pPr>
+        <w:pStyle w:val="Heading3"/>
+        <w:spacing w:after="120" w:before="240"/>
+      </w:pPr>
+      <w:r>
+        <w:rPr>
+          <w:rFonts w:ascii="Calibri" w:cs="Calibri" w:eastAsia="Calibri" w:hAnsi="Calibri"/>
+          <w:b/>
+          <w:bCs/>
+        </w:rPr>
+        <w:t xml:space="preserve">GET /me</w:t>
+      </w:r>
+    </w:p>
+    <w:p>
+      <w:pPr>
+        <w:spacing w:after="120"/>
+      </w:pPr>
+      <w:r>
+        <w:rPr>
+          <w:rFonts w:ascii="Calibri" w:cs="Calibri" w:eastAsia="Calibri" w:hAnsi="Calibri"/>
+          <w:sz w:val="20"/>
+          <w:szCs w:val="20"/>
+        </w:rPr>
+        <w:t xml:space="preserve">Returns the authenticated user's profile.</w:t>
+      </w:r>
+    </w:p>
+    <w:p>
+      <w:pPr>
+        <w:spacing w:after="120"/>
+      </w:pPr>
+      <w:r>
+        <w:rPr>
+          <w:rFonts w:ascii="Calibri" w:cs="Calibri" w:eastAsia="Calibri" w:hAnsi="Calibri"/>
+          <w:b/>
+          <w:bCs/>
+          <w:sz w:val="20"/>
+          <w:szCs w:val="20"/>
+        </w:rPr>
+        <w:t xml:space="preserve">Auth:</w:t>
+      </w:r>
+      <w:r>
+        <w:rPr>
+          <w:rFonts w:ascii="Calibri" w:cs="Calibri" w:eastAsia="Calibri" w:hAnsi="Calibri"/>
+          <w:sz w:val="20"/>
+          <w:szCs w:val="20"/>
+        </w:rPr>
+        <w:t xml:space="preserve"> Authenticated</w:t>
+      </w:r>
+    </w:p>
+    <w:p>
+      <w:pPr>
+        <w:spacing w:after="120"/>
+      </w:pPr>
+      <w:r>
+        <w:rPr>
+          <w:rFonts w:ascii="Calibri" w:cs="Calibri" w:eastAsia="Calibri" w:hAnsi="Calibri"/>
+          <w:b/>
+          <w:bCs/>
+          <w:sz w:val="20"/>
+          <w:szCs w:val="20"/>
+        </w:rPr>
+        <w:t xml:space="preserve">Response (200):</w:t>
+      </w:r>
+    </w:p>
+    <w:p>
+      <w:pPr>
+        <w:shd w:fill="F8FAFC" w:color="F8FAFC" w:val="solid"/>
+        <w:spacing w:after="0"/>
+        <w:ind w:left="200"/>
+      </w:pPr>
+      <w:r>
+        <w:rPr>
+          <w:rFonts w:ascii="Consolas" w:cs="Consolas" w:eastAsia="Consolas" w:hAnsi="Consolas"/>
+          <w:color w:val="334155"/>
+          <w:sz w:val="17"/>
+          <w:szCs w:val="17"/>
+        </w:rPr>
+        <w:t xml:space="preserve">{ "role": "super_admin", "workspace_id": null }</w:t>
+      </w:r>
+    </w:p>
+    <w:p>
+      <w:pPr>
+        <w:spacing w:after="120"/>
+      </w:pPr>
+    </w:p>
+    <w:p>
+      <w:pPr>
+        <w:pStyle w:val="Heading3"/>
+        <w:spacing w:after="120" w:before="240"/>
+      </w:pPr>
+      <w:r>
+        <w:rPr>
+          <w:rFonts w:ascii="Calibri" w:cs="Calibri" w:eastAsia="Calibri" w:hAnsi="Calibri"/>
+          <w:b/>
+          <w:bCs/>
+        </w:rPr>
+        <w:t xml:space="preserve">GET /workspaces</w:t>
+      </w:r>
+    </w:p>
+    <w:p>
+      <w:pPr>
+        <w:spacing w:after="120"/>
+      </w:pPr>
+      <w:r>
+        <w:rPr>
+          <w:rFonts w:ascii="Calibri" w:cs="Calibri" w:eastAsia="Calibri" w:hAnsi="Calibri"/>
+          <w:sz w:val="20"/>
+          <w:szCs w:val="20"/>
+        </w:rPr>
+        <w:t xml:space="preserve">List workspaces. Super admin sees all; workspace user sees only their own.</w:t>
+      </w:r>
+    </w:p>
+    <w:p>
+      <w:pPr>
+        <w:spacing w:after="120"/>
+      </w:pPr>
+      <w:r>
+        <w:rPr>
+          <w:rFonts w:ascii="Calibri" w:cs="Calibri" w:eastAsia="Calibri" w:hAnsi="Calibri"/>
+          <w:b/>
+          <w:bCs/>
+          <w:sz w:val="20"/>
+          <w:szCs w:val="20"/>
+        </w:rPr>
+        <w:t xml:space="preserve">Auth:</w:t>
+      </w:r>
+      <w:r>
+        <w:rPr>
+          <w:rFonts w:ascii="Calibri" w:cs="Calibri" w:eastAsia="Calibri" w:hAnsi="Calibri"/>
+          <w:sz w:val="20"/>
+          <w:szCs w:val="20"/>
+        </w:rPr>
+        <w:t xml:space="preserve"> Authenticated</w:t>
+      </w:r>
+    </w:p>
+    <w:p>
+      <w:pPr>
+        <w:spacing w:after="120"/>
+      </w:pPr>
+      <w:r>
+        <w:rPr>
+          <w:rFonts w:ascii="Calibri" w:cs="Calibri" w:eastAsia="Calibri" w:hAnsi="Calibri"/>
+          <w:b/>
+          <w:bCs/>
+          <w:sz w:val="20"/>
+          <w:szCs w:val="20"/>
+        </w:rPr>
+        <w:t xml:space="preserve">Response (200):</w:t>
+      </w:r>
+      <w:r>
+        <w:rPr>
+          <w:rFonts w:ascii="Calibri" w:cs="Calibri" w:eastAsia="Calibri" w:hAnsi="Calibri"/>
+          <w:sz w:val="20"/>
+          <w:szCs w:val="20"/>
+        </w:rPr>
+        <w:t xml:space="preserve"> Array of workspace objects with </w:t>
+      </w:r>
       <w:r>
         <w:rPr>
           <w:rFonts w:ascii="Consolas" w:cs="Consolas" w:eastAsia="Consolas" w:hAnsi="Consolas"/>
@@ -2894,6 +3074,1875 @@
           <w:szCs w:val="18"/>
           <w:shd w:fill="F1F5F9" w:color="F1F5F9" w:val="solid"/>
         </w:rPr>
+        <w:t xml:space="preserve">workspace_ad_accounts</w:t>
+      </w:r>
+      <w:r>
+        <w:rPr>
+          <w:rFonts w:ascii="Calibri" w:cs="Calibri" w:eastAsia="Calibri" w:hAnsi="Calibri"/>
+          <w:sz w:val="20"/>
+          <w:szCs w:val="20"/>
+        </w:rPr>
+        <w:t xml:space="preserve">.</w:t>
+      </w:r>
+    </w:p>
+    <w:p>
+      <w:pPr>
+        <w:pStyle w:val="Heading3"/>
+        <w:spacing w:after="120" w:before="240"/>
+      </w:pPr>
+      <w:r>
+        <w:rPr>
+          <w:rFonts w:ascii="Calibri" w:cs="Calibri" w:eastAsia="Calibri" w:hAnsi="Calibri"/>
+          <w:b/>
+          <w:bCs/>
+        </w:rPr>
+        <w:t xml:space="preserve">GET /workspaces/:id</w:t>
+      </w:r>
+    </w:p>
+    <w:p>
+      <w:pPr>
+        <w:spacing w:after="120"/>
+      </w:pPr>
+      <w:r>
+        <w:rPr>
+          <w:rFonts w:ascii="Calibri" w:cs="Calibri" w:eastAsia="Calibri" w:hAnsi="Calibri"/>
+          <w:sz w:val="20"/>
+          <w:szCs w:val="20"/>
+        </w:rPr>
+        <w:t xml:space="preserve">Single workspace with ad accounts and assigned user email.</w:t>
+      </w:r>
+    </w:p>
+    <w:p>
+      <w:pPr>
+        <w:spacing w:after="120"/>
+      </w:pPr>
+      <w:r>
+        <w:rPr>
+          <w:rFonts w:ascii="Calibri" w:cs="Calibri" w:eastAsia="Calibri" w:hAnsi="Calibri"/>
+          <w:b/>
+          <w:bCs/>
+          <w:sz w:val="20"/>
+          <w:szCs w:val="20"/>
+        </w:rPr>
+        <w:t xml:space="preserve">Auth:</w:t>
+      </w:r>
+      <w:r>
+        <w:rPr>
+          <w:rFonts w:ascii="Calibri" w:cs="Calibri" w:eastAsia="Calibri" w:hAnsi="Calibri"/>
+          <w:sz w:val="20"/>
+          <w:szCs w:val="20"/>
+        </w:rPr>
+        <w:t xml:space="preserve"> Workspace access (owner or super admin)</w:t>
+      </w:r>
+    </w:p>
+    <w:p>
+      <w:pPr>
+        <w:spacing w:after="120"/>
+      </w:pPr>
+      <w:r>
+        <w:rPr>
+          <w:rFonts w:ascii="Calibri" w:cs="Calibri" w:eastAsia="Calibri" w:hAnsi="Calibri"/>
+          <w:b/>
+          <w:bCs/>
+          <w:sz w:val="20"/>
+          <w:szCs w:val="20"/>
+        </w:rPr>
+        <w:t xml:space="preserve">Response (200):</w:t>
+      </w:r>
+      <w:r>
+        <w:rPr>
+          <w:rFonts w:ascii="Calibri" w:cs="Calibri" w:eastAsia="Calibri" w:hAnsi="Calibri"/>
+          <w:sz w:val="20"/>
+          <w:szCs w:val="20"/>
+        </w:rPr>
+        <w:t xml:space="preserve"> Workspace object. </w:t>
+      </w:r>
+      <w:r>
+        <w:rPr>
+          <w:rFonts w:ascii="Consolas" w:cs="Consolas" w:eastAsia="Consolas" w:hAnsi="Consolas"/>
+          <w:sz w:val="18"/>
+          <w:szCs w:val="18"/>
+          <w:shd w:fill="F1F5F9" w:color="F1F5F9" w:val="solid"/>
+        </w:rPr>
+        <w:t xml:space="preserve">access_token</w:t>
+      </w:r>
+      <w:r>
+        <w:rPr>
+          <w:rFonts w:ascii="Calibri" w:cs="Calibri" w:eastAsia="Calibri" w:hAnsi="Calibri"/>
+          <w:sz w:val="20"/>
+          <w:szCs w:val="20"/>
+        </w:rPr>
+        <w:t xml:space="preserve"> is stripped from ad accounts.</w:t>
+      </w:r>
+    </w:p>
+    <w:p>
+      <w:pPr>
+        <w:spacing w:after="120"/>
+      </w:pPr>
+      <w:r>
+        <w:rPr>
+          <w:rFonts w:ascii="Calibri" w:cs="Calibri" w:eastAsia="Calibri" w:hAnsi="Calibri"/>
+          <w:sz w:val="20"/>
+          <w:szCs w:val="20"/>
+        </w:rPr>
+        <w:t xml:space="preserve">Includes </w:t>
+      </w:r>
+      <w:r>
+        <w:rPr>
+          <w:rFonts w:ascii="Consolas" w:cs="Consolas" w:eastAsia="Consolas" w:hAnsi="Consolas"/>
+          <w:sz w:val="18"/>
+          <w:szCs w:val="18"/>
+          <w:shd w:fill="F1F5F9" w:color="F1F5F9" w:val="solid"/>
+        </w:rPr>
+        <w:t xml:space="preserve">assigned_user_email</w:t>
+      </w:r>
+      <w:r>
+        <w:rPr>
+          <w:rFonts w:ascii="Calibri" w:cs="Calibri" w:eastAsia="Calibri" w:hAnsi="Calibri"/>
+          <w:sz w:val="20"/>
+          <w:szCs w:val="20"/>
+        </w:rPr>
+        <w:t xml:space="preserve"> if a user is linked.</w:t>
+      </w:r>
+    </w:p>
+    <w:p>
+      <w:pPr>
+        <w:pStyle w:val="Heading3"/>
+        <w:spacing w:after="120" w:before="240"/>
+      </w:pPr>
+      <w:r>
+        <w:rPr>
+          <w:rFonts w:ascii="Calibri" w:cs="Calibri" w:eastAsia="Calibri" w:hAnsi="Calibri"/>
+          <w:b/>
+          <w:bCs/>
+        </w:rPr>
+        <w:t xml:space="preserve">POST /workspaces</w:t>
+      </w:r>
+    </w:p>
+    <w:p>
+      <w:pPr>
+        <w:spacing w:after="120"/>
+      </w:pPr>
+      <w:r>
+        <w:rPr>
+          <w:rFonts w:ascii="Calibri" w:cs="Calibri" w:eastAsia="Calibri" w:hAnsi="Calibri"/>
+          <w:sz w:val="20"/>
+          <w:szCs w:val="20"/>
+        </w:rPr>
+        <w:t xml:space="preserve">Create a new workspace.</w:t>
+      </w:r>
+    </w:p>
+    <w:p>
+      <w:pPr>
+        <w:spacing w:after="120"/>
+      </w:pPr>
+      <w:r>
+        <w:rPr>
+          <w:rFonts w:ascii="Calibri" w:cs="Calibri" w:eastAsia="Calibri" w:hAnsi="Calibri"/>
+          <w:b/>
+          <w:bCs/>
+          <w:sz w:val="20"/>
+          <w:szCs w:val="20"/>
+        </w:rPr>
+        <w:t xml:space="preserve">Auth:</w:t>
+      </w:r>
+      <w:r>
+        <w:rPr>
+          <w:rFonts w:ascii="Calibri" w:cs="Calibri" w:eastAsia="Calibri" w:hAnsi="Calibri"/>
+          <w:sz w:val="20"/>
+          <w:szCs w:val="20"/>
+        </w:rPr>
+        <w:t xml:space="preserve"> Super admin</w:t>
+      </w:r>
+    </w:p>
+    <w:p>
+      <w:pPr>
+        <w:spacing w:after="120"/>
+      </w:pPr>
+      <w:r>
+        <w:rPr>
+          <w:rFonts w:ascii="Calibri" w:cs="Calibri" w:eastAsia="Calibri" w:hAnsi="Calibri"/>
+          <w:b/>
+          <w:bCs/>
+          <w:sz w:val="20"/>
+          <w:szCs w:val="20"/>
+        </w:rPr>
+        <w:t xml:space="preserve">Request body:</w:t>
+      </w:r>
+    </w:p>
+    <w:p>
+      <w:pPr>
+        <w:shd w:fill="F8FAFC" w:color="F8FAFC" w:val="solid"/>
+        <w:spacing w:after="0"/>
+        <w:ind w:left="200"/>
+      </w:pPr>
+      <w:r>
+        <w:rPr>
+          <w:rFonts w:ascii="Consolas" w:cs="Consolas" w:eastAsia="Consolas" w:hAnsi="Consolas"/>
+          <w:color w:val="334155"/>
+          <w:sz w:val="17"/>
+          <w:szCs w:val="17"/>
+        </w:rPr>
+        <w:t xml:space="preserve">{ "name": "Client Name" }</w:t>
+      </w:r>
+    </w:p>
+    <w:p>
+      <w:pPr>
+        <w:spacing w:after="120"/>
+      </w:pPr>
+    </w:p>
+    <w:p>
+      <w:pPr>
+        <w:pStyle w:val="Heading3"/>
+        <w:spacing w:after="120" w:before="240"/>
+      </w:pPr>
+      <w:r>
+        <w:rPr>
+          <w:rFonts w:ascii="Calibri" w:cs="Calibri" w:eastAsia="Calibri" w:hAnsi="Calibri"/>
+          <w:b/>
+          <w:bCs/>
+        </w:rPr>
+        <w:t xml:space="preserve">PATCH /workspaces/:id</w:t>
+      </w:r>
+    </w:p>
+    <w:p>
+      <w:pPr>
+        <w:spacing w:after="120"/>
+      </w:pPr>
+      <w:r>
+        <w:rPr>
+          <w:rFonts w:ascii="Calibri" w:cs="Calibri" w:eastAsia="Calibri" w:hAnsi="Calibri"/>
+          <w:sz w:val="20"/>
+          <w:szCs w:val="20"/>
+        </w:rPr>
+        <w:t xml:space="preserve">Update workspace fields.</w:t>
+      </w:r>
+    </w:p>
+    <w:p>
+      <w:pPr>
+        <w:spacing w:after="120"/>
+      </w:pPr>
+      <w:r>
+        <w:rPr>
+          <w:rFonts w:ascii="Calibri" w:cs="Calibri" w:eastAsia="Calibri" w:hAnsi="Calibri"/>
+          <w:b/>
+          <w:bCs/>
+          <w:sz w:val="20"/>
+          <w:szCs w:val="20"/>
+        </w:rPr>
+        <w:t xml:space="preserve">Auth:</w:t>
+      </w:r>
+      <w:r>
+        <w:rPr>
+          <w:rFonts w:ascii="Calibri" w:cs="Calibri" w:eastAsia="Calibri" w:hAnsi="Calibri"/>
+          <w:sz w:val="20"/>
+          <w:szCs w:val="20"/>
+        </w:rPr>
+        <w:t xml:space="preserve"> Super admin</w:t>
+      </w:r>
+    </w:p>
+    <w:p>
+      <w:pPr>
+        <w:spacing w:after="120"/>
+      </w:pPr>
+      <w:r>
+        <w:rPr>
+          <w:rFonts w:ascii="Calibri" w:cs="Calibri" w:eastAsia="Calibri" w:hAnsi="Calibri"/>
+          <w:b/>
+          <w:bCs/>
+          <w:sz w:val="20"/>
+          <w:szCs w:val="20"/>
+        </w:rPr>
+        <w:t xml:space="preserve">Request body:</w:t>
+      </w:r>
+      <w:r>
+        <w:rPr>
+          <w:rFonts w:ascii="Calibri" w:cs="Calibri" w:eastAsia="Calibri" w:hAnsi="Calibri"/>
+          <w:sz w:val="20"/>
+          <w:szCs w:val="20"/>
+        </w:rPr>
+        <w:t xml:space="preserve"> Any workspace fields to update.</w:t>
+      </w:r>
+    </w:p>
+    <w:p>
+      <w:pPr>
+        <w:pStyle w:val="Heading3"/>
+        <w:spacing w:after="120" w:before="240"/>
+      </w:pPr>
+      <w:r>
+        <w:rPr>
+          <w:rFonts w:ascii="Calibri" w:cs="Calibri" w:eastAsia="Calibri" w:hAnsi="Calibri"/>
+          <w:b/>
+          <w:bCs/>
+        </w:rPr>
+        <w:t xml:space="preserve">GET /workspaces/:id/ad-accounts</w:t>
+      </w:r>
+    </w:p>
+    <w:p>
+      <w:pPr>
+        <w:spacing w:after="120"/>
+      </w:pPr>
+      <w:r>
+        <w:rPr>
+          <w:rFonts w:ascii="Calibri" w:cs="Calibri" w:eastAsia="Calibri" w:hAnsi="Calibri"/>
+          <w:sz w:val="20"/>
+          <w:szCs w:val="20"/>
+        </w:rPr>
+        <w:t xml:space="preserve">List ad accounts for a workspace (access_token excluded).</w:t>
+      </w:r>
+    </w:p>
+    <w:p>
+      <w:pPr>
+        <w:spacing w:after="120"/>
+      </w:pPr>
+      <w:r>
+        <w:rPr>
+          <w:rFonts w:ascii="Calibri" w:cs="Calibri" w:eastAsia="Calibri" w:hAnsi="Calibri"/>
+          <w:b/>
+          <w:bCs/>
+          <w:sz w:val="20"/>
+          <w:szCs w:val="20"/>
+        </w:rPr>
+        <w:t xml:space="preserve">Auth:</w:t>
+      </w:r>
+      <w:r>
+        <w:rPr>
+          <w:rFonts w:ascii="Calibri" w:cs="Calibri" w:eastAsia="Calibri" w:hAnsi="Calibri"/>
+          <w:sz w:val="20"/>
+          <w:szCs w:val="20"/>
+        </w:rPr>
+        <w:t xml:space="preserve"> Workspace access</w:t>
+      </w:r>
+    </w:p>
+    <w:p>
+      <w:pPr>
+        <w:pStyle w:val="Heading3"/>
+        <w:spacing w:after="120" w:before="240"/>
+      </w:pPr>
+      <w:r>
+        <w:rPr>
+          <w:rFonts w:ascii="Calibri" w:cs="Calibri" w:eastAsia="Calibri" w:hAnsi="Calibri"/>
+          <w:b/>
+          <w:bCs/>
+        </w:rPr>
+        <w:t xml:space="preserve">GET /workspaces/:id/rules</w:t>
+      </w:r>
+    </w:p>
+    <w:p>
+      <w:pPr>
+        <w:spacing w:after="120"/>
+      </w:pPr>
+      <w:r>
+        <w:rPr>
+          <w:rFonts w:ascii="Calibri" w:cs="Calibri" w:eastAsia="Calibri" w:hAnsi="Calibri"/>
+          <w:sz w:val="20"/>
+          <w:szCs w:val="20"/>
+        </w:rPr>
+        <w:t xml:space="preserve">List all rules for a workspace.</w:t>
+      </w:r>
+    </w:p>
+    <w:p>
+      <w:pPr>
+        <w:spacing w:after="120"/>
+      </w:pPr>
+      <w:r>
+        <w:rPr>
+          <w:rFonts w:ascii="Calibri" w:cs="Calibri" w:eastAsia="Calibri" w:hAnsi="Calibri"/>
+          <w:b/>
+          <w:bCs/>
+          <w:sz w:val="20"/>
+          <w:szCs w:val="20"/>
+        </w:rPr>
+        <w:t xml:space="preserve">Auth:</w:t>
+      </w:r>
+      <w:r>
+        <w:rPr>
+          <w:rFonts w:ascii="Calibri" w:cs="Calibri" w:eastAsia="Calibri" w:hAnsi="Calibri"/>
+          <w:sz w:val="20"/>
+          <w:szCs w:val="20"/>
+        </w:rPr>
+        <w:t xml:space="preserve"> Workspace access</w:t>
+      </w:r>
+    </w:p>
+    <w:p>
+      <w:pPr>
+        <w:pStyle w:val="Heading3"/>
+        <w:spacing w:after="120" w:before="240"/>
+      </w:pPr>
+      <w:r>
+        <w:rPr>
+          <w:rFonts w:ascii="Calibri" w:cs="Calibri" w:eastAsia="Calibri" w:hAnsi="Calibri"/>
+          <w:b/>
+          <w:bCs/>
+        </w:rPr>
+        <w:t xml:space="preserve">GET /workspaces/:id/alerts</w:t>
+      </w:r>
+    </w:p>
+    <w:p>
+      <w:pPr>
+        <w:spacing w:after="120"/>
+      </w:pPr>
+      <w:r>
+        <w:rPr>
+          <w:rFonts w:ascii="Calibri" w:cs="Calibri" w:eastAsia="Calibri" w:hAnsi="Calibri"/>
+          <w:sz w:val="20"/>
+          <w:szCs w:val="20"/>
+        </w:rPr>
+        <w:t xml:space="preserve">List alerts for a workspace.</w:t>
+      </w:r>
+    </w:p>
+    <w:p>
+      <w:pPr>
+        <w:spacing w:after="120"/>
+      </w:pPr>
+      <w:r>
+        <w:rPr>
+          <w:rFonts w:ascii="Calibri" w:cs="Calibri" w:eastAsia="Calibri" w:hAnsi="Calibri"/>
+          <w:b/>
+          <w:bCs/>
+          <w:sz w:val="20"/>
+          <w:szCs w:val="20"/>
+        </w:rPr>
+        <w:t xml:space="preserve">Auth:</w:t>
+      </w:r>
+      <w:r>
+        <w:rPr>
+          <w:rFonts w:ascii="Calibri" w:cs="Calibri" w:eastAsia="Calibri" w:hAnsi="Calibri"/>
+          <w:sz w:val="20"/>
+          <w:szCs w:val="20"/>
+        </w:rPr>
+        <w:t xml:space="preserve"> Workspace access</w:t>
+      </w:r>
+    </w:p>
+    <w:p>
+      <w:pPr>
+        <w:spacing w:after="120"/>
+      </w:pPr>
+      <w:r>
+        <w:rPr>
+          <w:rFonts w:ascii="Calibri" w:cs="Calibri" w:eastAsia="Calibri" w:hAnsi="Calibri"/>
+          <w:b/>
+          <w:bCs/>
+          <w:sz w:val="20"/>
+          <w:szCs w:val="20"/>
+        </w:rPr>
+        <w:t xml:space="preserve">Query params:</w:t>
+      </w:r>
+    </w:p>
+    <w:p>
+      <w:pPr>
+        <w:pStyle w:val="ListParagraph"/>
+        <w:numPr>
+          <w:ilvl w:val="0"/>
+          <w:numId w:val="1"/>
+        </w:numPr>
+        <w:spacing w:after="60"/>
+      </w:pPr>
+      <w:r>
+        <w:rPr>
+          <w:rFonts w:ascii="Consolas" w:cs="Consolas" w:eastAsia="Consolas" w:hAnsi="Consolas"/>
+          <w:sz w:val="18"/>
+          <w:szCs w:val="18"/>
+          <w:shd w:fill="F1F5F9" w:color="F1F5F9" w:val="solid"/>
+        </w:rPr>
+        <w:t xml:space="preserve">active_only=true</w:t>
+      </w:r>
+      <w:r>
+        <w:rPr>
+          <w:rFonts w:ascii="Calibri" w:cs="Calibri" w:eastAsia="Calibri" w:hAnsi="Calibri"/>
+          <w:sz w:val="20"/>
+          <w:szCs w:val="20"/>
+        </w:rPr>
+        <w:t xml:space="preserve"> (optional): Only return unresolved alerts</w:t>
+      </w:r>
+    </w:p>
+    <w:p>
+      <w:pPr>
+        <w:pStyle w:val="Heading3"/>
+        <w:spacing w:after="120" w:before="240"/>
+      </w:pPr>
+      <w:r>
+        <w:rPr>
+          <w:rFonts w:ascii="Calibri" w:cs="Calibri" w:eastAsia="Calibri" w:hAnsi="Calibri"/>
+          <w:b/>
+          <w:bCs/>
+        </w:rPr>
+        <w:t xml:space="preserve">GET /workspaces/:id/campaigns</w:t>
+      </w:r>
+    </w:p>
+    <w:p>
+      <w:pPr>
+        <w:spacing w:after="120"/>
+      </w:pPr>
+      <w:r>
+        <w:rPr>
+          <w:rFonts w:ascii="Calibri" w:cs="Calibri" w:eastAsia="Calibri" w:hAnsi="Calibri"/>
+          <w:sz w:val="20"/>
+          <w:szCs w:val="20"/>
+        </w:rPr>
+        <w:t xml:space="preserve">Enriched campaign view: entities + rules + active violations per entity.</w:t>
+      </w:r>
+    </w:p>
+    <w:p>
+      <w:pPr>
+        <w:spacing w:after="120"/>
+      </w:pPr>
+      <w:r>
+        <w:rPr>
+          <w:rFonts w:ascii="Calibri" w:cs="Calibri" w:eastAsia="Calibri" w:hAnsi="Calibri"/>
+          <w:b/>
+          <w:bCs/>
+          <w:sz w:val="20"/>
+          <w:szCs w:val="20"/>
+        </w:rPr>
+        <w:t xml:space="preserve">Auth:</w:t>
+      </w:r>
+      <w:r>
+        <w:rPr>
+          <w:rFonts w:ascii="Calibri" w:cs="Calibri" w:eastAsia="Calibri" w:hAnsi="Calibri"/>
+          <w:sz w:val="20"/>
+          <w:szCs w:val="20"/>
+        </w:rPr>
+        <w:t xml:space="preserve"> Workspace access</w:t>
+      </w:r>
+    </w:p>
+    <w:p>
+      <w:pPr>
+        <w:spacing w:after="120"/>
+      </w:pPr>
+      <w:r>
+        <w:rPr>
+          <w:rFonts w:ascii="Calibri" w:cs="Calibri" w:eastAsia="Calibri" w:hAnsi="Calibri"/>
+          <w:b/>
+          <w:bCs/>
+          <w:sz w:val="20"/>
+          <w:szCs w:val="20"/>
+        </w:rPr>
+        <w:t xml:space="preserve">Response (200):</w:t>
+      </w:r>
+      <w:r>
+        <w:rPr>
+          <w:rFonts w:ascii="Calibri" w:cs="Calibri" w:eastAsia="Calibri" w:hAnsi="Calibri"/>
+          <w:sz w:val="20"/>
+          <w:szCs w:val="20"/>
+        </w:rPr>
+        <w:t xml:space="preserve"> Array of entity objects, each with </w:t>
+      </w:r>
+      <w:r>
+        <w:rPr>
+          <w:rFonts w:ascii="Consolas" w:cs="Consolas" w:eastAsia="Consolas" w:hAnsi="Consolas"/>
+          <w:sz w:val="18"/>
+          <w:szCs w:val="18"/>
+          <w:shd w:fill="F1F5F9" w:color="F1F5F9" w:val="solid"/>
+        </w:rPr>
+        <w:t xml:space="preserve">rules</w:t>
+      </w:r>
+      <w:r>
+        <w:rPr>
+          <w:rFonts w:ascii="Calibri" w:cs="Calibri" w:eastAsia="Calibri" w:hAnsi="Calibri"/>
+          <w:sz w:val="20"/>
+          <w:szCs w:val="20"/>
+        </w:rPr>
+        <w:t xml:space="preserve"> (array) and</w:t>
+      </w:r>
+    </w:p>
+    <w:p>
+      <w:pPr>
+        <w:spacing w:after="120"/>
+      </w:pPr>
+      <w:r>
+        <w:rPr>
+          <w:rFonts w:ascii="Consolas" w:cs="Consolas" w:eastAsia="Consolas" w:hAnsi="Consolas"/>
+          <w:sz w:val="18"/>
+          <w:szCs w:val="18"/>
+          <w:shd w:fill="F1F5F9" w:color="F1F5F9" w:val="solid"/>
+        </w:rPr>
+        <w:t xml:space="preserve">violations</w:t>
+      </w:r>
+      <w:r>
+        <w:rPr>
+          <w:rFonts w:ascii="Calibri" w:cs="Calibri" w:eastAsia="Calibri" w:hAnsi="Calibri"/>
+          <w:sz w:val="20"/>
+          <w:szCs w:val="20"/>
+        </w:rPr>
+        <w:t xml:space="preserve"> (count).</w:t>
+      </w:r>
+    </w:p>
+    <w:p>
+      <w:pPr>
+        <w:pStyle w:val="Heading3"/>
+        <w:spacing w:after="120" w:before="240"/>
+      </w:pPr>
+      <w:r>
+        <w:rPr>
+          <w:rFonts w:ascii="Calibri" w:cs="Calibri" w:eastAsia="Calibri" w:hAnsi="Calibri"/>
+          <w:b/>
+          <w:bCs/>
+        </w:rPr>
+        <w:t xml:space="preserve">GET /workspaces/:id/entities</w:t>
+      </w:r>
+    </w:p>
+    <w:p>
+      <w:pPr>
+        <w:spacing w:after="120"/>
+      </w:pPr>
+      <w:r>
+        <w:rPr>
+          <w:rFonts w:ascii="Calibri" w:cs="Calibri" w:eastAsia="Calibri" w:hAnsi="Calibri"/>
+          <w:sz w:val="20"/>
+          <w:szCs w:val="20"/>
+        </w:rPr>
+        <w:t xml:space="preserve">Entity cache rows for a workspace.</w:t>
+      </w:r>
+    </w:p>
+    <w:p>
+      <w:pPr>
+        <w:spacing w:after="120"/>
+      </w:pPr>
+      <w:r>
+        <w:rPr>
+          <w:rFonts w:ascii="Calibri" w:cs="Calibri" w:eastAsia="Calibri" w:hAnsi="Calibri"/>
+          <w:b/>
+          <w:bCs/>
+          <w:sz w:val="20"/>
+          <w:szCs w:val="20"/>
+        </w:rPr>
+        <w:t xml:space="preserve">Auth:</w:t>
+      </w:r>
+      <w:r>
+        <w:rPr>
+          <w:rFonts w:ascii="Calibri" w:cs="Calibri" w:eastAsia="Calibri" w:hAnsi="Calibri"/>
+          <w:sz w:val="20"/>
+          <w:szCs w:val="20"/>
+        </w:rPr>
+        <w:t xml:space="preserve"> Workspace access</w:t>
+      </w:r>
+    </w:p>
+    <w:p>
+      <w:pPr>
+        <w:spacing w:after="120"/>
+      </w:pPr>
+      <w:r>
+        <w:rPr>
+          <w:rFonts w:ascii="Calibri" w:cs="Calibri" w:eastAsia="Calibri" w:hAnsi="Calibri"/>
+          <w:b/>
+          <w:bCs/>
+          <w:sz w:val="20"/>
+          <w:szCs w:val="20"/>
+        </w:rPr>
+        <w:t xml:space="preserve">Query params:</w:t>
+      </w:r>
+    </w:p>
+    <w:p>
+      <w:pPr>
+        <w:pStyle w:val="ListParagraph"/>
+        <w:numPr>
+          <w:ilvl w:val="0"/>
+          <w:numId w:val="1"/>
+        </w:numPr>
+        <w:spacing w:after="60"/>
+      </w:pPr>
+      <w:r>
+        <w:rPr>
+          <w:rFonts w:ascii="Consolas" w:cs="Consolas" w:eastAsia="Consolas" w:hAnsi="Consolas"/>
+          <w:sz w:val="18"/>
+          <w:szCs w:val="18"/>
+          <w:shd w:fill="F1F5F9" w:color="F1F5F9" w:val="solid"/>
+        </w:rPr>
+        <w:t xml:space="preserve">entity_type</w:t>
+      </w:r>
+      <w:r>
+        <w:rPr>
+          <w:rFonts w:ascii="Calibri" w:cs="Calibri" w:eastAsia="Calibri" w:hAnsi="Calibri"/>
+          <w:sz w:val="20"/>
+          <w:szCs w:val="20"/>
+        </w:rPr>
+        <w:t xml:space="preserve"> (optional): Filter by </w:t>
+      </w:r>
+      <w:r>
+        <w:rPr>
+          <w:rFonts w:ascii="Consolas" w:cs="Consolas" w:eastAsia="Consolas" w:hAnsi="Consolas"/>
+          <w:sz w:val="18"/>
+          <w:szCs w:val="18"/>
+          <w:shd w:fill="F1F5F9" w:color="F1F5F9" w:val="solid"/>
+        </w:rPr>
+        <w:t xml:space="preserve">campaign</w:t>
+      </w:r>
+      <w:r>
+        <w:rPr>
+          <w:rFonts w:ascii="Calibri" w:cs="Calibri" w:eastAsia="Calibri" w:hAnsi="Calibri"/>
+          <w:sz w:val="20"/>
+          <w:szCs w:val="20"/>
+        </w:rPr>
+        <w:t xml:space="preserve">, </w:t>
+      </w:r>
+      <w:r>
+        <w:rPr>
+          <w:rFonts w:ascii="Consolas" w:cs="Consolas" w:eastAsia="Consolas" w:hAnsi="Consolas"/>
+          <w:sz w:val="18"/>
+          <w:szCs w:val="18"/>
+          <w:shd w:fill="F1F5F9" w:color="F1F5F9" w:val="solid"/>
+        </w:rPr>
+        <w:t xml:space="preserve">adset</w:t>
+      </w:r>
+      <w:r>
+        <w:rPr>
+          <w:rFonts w:ascii="Calibri" w:cs="Calibri" w:eastAsia="Calibri" w:hAnsi="Calibri"/>
+          <w:sz w:val="20"/>
+          <w:szCs w:val="20"/>
+        </w:rPr>
+        <w:t xml:space="preserve">, or </w:t>
+      </w:r>
+      <w:r>
+        <w:rPr>
+          <w:rFonts w:ascii="Consolas" w:cs="Consolas" w:eastAsia="Consolas" w:hAnsi="Consolas"/>
+          <w:sz w:val="18"/>
+          <w:szCs w:val="18"/>
+          <w:shd w:fill="F1F5F9" w:color="F1F5F9" w:val="solid"/>
+        </w:rPr>
+        <w:t xml:space="preserve">ad</w:t>
+      </w:r>
+    </w:p>
+    <w:p>
+      <w:pPr>
+        <w:pStyle w:val="Heading3"/>
+        <w:spacing w:after="120" w:before="240"/>
+      </w:pPr>
+      <w:r>
+        <w:rPr>
+          <w:rFonts w:ascii="Calibri" w:cs="Calibri" w:eastAsia="Calibri" w:hAnsi="Calibri"/>
+          <w:b/>
+          <w:bCs/>
+        </w:rPr>
+        <w:t xml:space="preserve">POST /rules</w:t>
+      </w:r>
+    </w:p>
+    <w:p>
+      <w:pPr>
+        <w:spacing w:after="120"/>
+      </w:pPr>
+      <w:r>
+        <w:rPr>
+          <w:rFonts w:ascii="Calibri" w:cs="Calibri" w:eastAsia="Calibri" w:hAnsi="Calibri"/>
+          <w:sz w:val="20"/>
+          <w:szCs w:val="20"/>
+        </w:rPr>
+        <w:t xml:space="preserve">Create a new validation rule. Backend sets </w:t>
+      </w:r>
+      <w:r>
+        <w:rPr>
+          <w:rFonts w:ascii="Consolas" w:cs="Consolas" w:eastAsia="Consolas" w:hAnsi="Consolas"/>
+          <w:sz w:val="18"/>
+          <w:szCs w:val="18"/>
+          <w:shd w:fill="F1F5F9" w:color="F1F5F9" w:val="solid"/>
+        </w:rPr>
+        <w:t xml:space="preserve">created_by</w:t>
+      </w:r>
+      <w:r>
+        <w:rPr>
+          <w:rFonts w:ascii="Calibri" w:cs="Calibri" w:eastAsia="Calibri" w:hAnsi="Calibri"/>
+          <w:sz w:val="20"/>
+          <w:szCs w:val="20"/>
+        </w:rPr>
+        <w:t xml:space="preserve"> and </w:t>
+      </w:r>
+      <w:r>
+        <w:rPr>
+          <w:rFonts w:ascii="Consolas" w:cs="Consolas" w:eastAsia="Consolas" w:hAnsi="Consolas"/>
+          <w:sz w:val="18"/>
+          <w:szCs w:val="18"/>
+          <w:shd w:fill="F1F5F9" w:color="F1F5F9" w:val="solid"/>
+        </w:rPr>
+        <w:t xml:space="preserve">updated_by</w:t>
+      </w:r>
+      <w:r>
+        <w:rPr>
+          <w:rFonts w:ascii="Calibri" w:cs="Calibri" w:eastAsia="Calibri" w:hAnsi="Calibri"/>
+          <w:sz w:val="20"/>
+          <w:szCs w:val="20"/>
+        </w:rPr>
+        <w:t xml:space="preserve"> from</w:t>
+      </w:r>
+    </w:p>
+    <w:p>
+      <w:pPr>
+        <w:spacing w:after="120"/>
+      </w:pPr>
+      <w:r>
+        <w:rPr>
+          <w:rFonts w:ascii="Calibri" w:cs="Calibri" w:eastAsia="Calibri" w:hAnsi="Calibri"/>
+          <w:sz w:val="20"/>
+          <w:szCs w:val="20"/>
+        </w:rPr>
+        <w:t xml:space="preserve">the JWT — frontend does not need to pass these fields.</w:t>
+      </w:r>
+    </w:p>
+    <w:p>
+      <w:pPr>
+        <w:spacing w:after="120"/>
+      </w:pPr>
+      <w:r>
+        <w:rPr>
+          <w:rFonts w:ascii="Calibri" w:cs="Calibri" w:eastAsia="Calibri" w:hAnsi="Calibri"/>
+          <w:b/>
+          <w:bCs/>
+          <w:sz w:val="20"/>
+          <w:szCs w:val="20"/>
+        </w:rPr>
+        <w:t xml:space="preserve">Auth:</w:t>
+      </w:r>
+      <w:r>
+        <w:rPr>
+          <w:rFonts w:ascii="Calibri" w:cs="Calibri" w:eastAsia="Calibri" w:hAnsi="Calibri"/>
+          <w:sz w:val="20"/>
+          <w:szCs w:val="20"/>
+        </w:rPr>
+        <w:t xml:space="preserve"> Workspace access (checked against </w:t>
+      </w:r>
+      <w:r>
+        <w:rPr>
+          <w:rFonts w:ascii="Consolas" w:cs="Consolas" w:eastAsia="Consolas" w:hAnsi="Consolas"/>
+          <w:sz w:val="18"/>
+          <w:szCs w:val="18"/>
+          <w:shd w:fill="F1F5F9" w:color="F1F5F9" w:val="solid"/>
+        </w:rPr>
+        <w:t xml:space="preserve">workspace_id</w:t>
+      </w:r>
+      <w:r>
+        <w:rPr>
+          <w:rFonts w:ascii="Calibri" w:cs="Calibri" w:eastAsia="Calibri" w:hAnsi="Calibri"/>
+          <w:sz w:val="20"/>
+          <w:szCs w:val="20"/>
+        </w:rPr>
+        <w:t xml:space="preserve"> in body)</w:t>
+      </w:r>
+    </w:p>
+    <w:p>
+      <w:pPr>
+        <w:spacing w:after="120"/>
+      </w:pPr>
+      <w:r>
+        <w:rPr>
+          <w:rFonts w:ascii="Calibri" w:cs="Calibri" w:eastAsia="Calibri" w:hAnsi="Calibri"/>
+          <w:b/>
+          <w:bCs/>
+          <w:sz w:val="20"/>
+          <w:szCs w:val="20"/>
+        </w:rPr>
+        <w:t xml:space="preserve">Request body:</w:t>
+      </w:r>
+    </w:p>
+    <w:p>
+      <w:pPr>
+        <w:shd w:fill="F8FAFC" w:color="F8FAFC" w:val="solid"/>
+        <w:spacing w:after="0"/>
+        <w:ind w:left="200"/>
+      </w:pPr>
+      <w:r>
+        <w:rPr>
+          <w:rFonts w:ascii="Consolas" w:cs="Consolas" w:eastAsia="Consolas" w:hAnsi="Consolas"/>
+          <w:color w:val="334155"/>
+          <w:sz w:val="17"/>
+          <w:szCs w:val="17"/>
+        </w:rPr>
+        <w:t xml:space="preserve">{</w:t>
+      </w:r>
+    </w:p>
+    <w:p>
+      <w:pPr>
+        <w:shd w:fill="F8FAFC" w:color="F8FAFC" w:val="solid"/>
+        <w:spacing w:after="0"/>
+        <w:ind w:left="200"/>
+      </w:pPr>
+      <w:r>
+        <w:rPr>
+          <w:rFonts w:ascii="Consolas" w:cs="Consolas" w:eastAsia="Consolas" w:hAnsi="Consolas"/>
+          <w:color w:val="334155"/>
+          <w:sz w:val="17"/>
+          <w:szCs w:val="17"/>
+        </w:rPr>
+        <w:t xml:space="preserve">  "workspace_id": 2,</w:t>
+      </w:r>
+    </w:p>
+    <w:p>
+      <w:pPr>
+        <w:shd w:fill="F8FAFC" w:color="F8FAFC" w:val="solid"/>
+        <w:spacing w:after="0"/>
+        <w:ind w:left="200"/>
+      </w:pPr>
+      <w:r>
+        <w:rPr>
+          <w:rFonts w:ascii="Consolas" w:cs="Consolas" w:eastAsia="Consolas" w:hAnsi="Consolas"/>
+          <w:color w:val="334155"/>
+          <w:sz w:val="17"/>
+          <w:szCs w:val="17"/>
+        </w:rPr>
+        <w:t xml:space="preserve">  "ad_account_id": "act_882341345153629",</w:t>
+      </w:r>
+    </w:p>
+    <w:p>
+      <w:pPr>
+        <w:shd w:fill="F8FAFC" w:color="F8FAFC" w:val="solid"/>
+        <w:spacing w:after="0"/>
+        <w:ind w:left="200"/>
+      </w:pPr>
+      <w:r>
+        <w:rPr>
+          <w:rFonts w:ascii="Consolas" w:cs="Consolas" w:eastAsia="Consolas" w:hAnsi="Consolas"/>
+          <w:color w:val="334155"/>
+          <w:sz w:val="17"/>
+          <w:szCs w:val="17"/>
+        </w:rPr>
+        <w:t xml:space="preserve">  "entity_type": "campaign",</w:t>
+      </w:r>
+    </w:p>
+    <w:p>
+      <w:pPr>
+        <w:shd w:fill="F8FAFC" w:color="F8FAFC" w:val="solid"/>
+        <w:spacing w:after="0"/>
+        <w:ind w:left="200"/>
+      </w:pPr>
+      <w:r>
+        <w:rPr>
+          <w:rFonts w:ascii="Consolas" w:cs="Consolas" w:eastAsia="Consolas" w:hAnsi="Consolas"/>
+          <w:color w:val="334155"/>
+          <w:sz w:val="17"/>
+          <w:szCs w:val="17"/>
+        </w:rPr>
+        <w:t xml:space="preserve">  "entity_id": "120207117933690269",</w:t>
+      </w:r>
+    </w:p>
+    <w:p>
+      <w:pPr>
+        <w:shd w:fill="F8FAFC" w:color="F8FAFC" w:val="solid"/>
+        <w:spacing w:after="0"/>
+        <w:ind w:left="200"/>
+      </w:pPr>
+      <w:r>
+        <w:rPr>
+          <w:rFonts w:ascii="Consolas" w:cs="Consolas" w:eastAsia="Consolas" w:hAnsi="Consolas"/>
+          <w:color w:val="334155"/>
+          <w:sz w:val="17"/>
+          <w:szCs w:val="17"/>
+        </w:rPr>
+        <w:t xml:space="preserve">  "entity_name": "Brand Campaign Q4",</w:t>
+      </w:r>
+    </w:p>
+    <w:p>
+      <w:pPr>
+        <w:shd w:fill="F8FAFC" w:color="F8FAFC" w:val="solid"/>
+        <w:spacing w:after="0"/>
+        <w:ind w:left="200"/>
+      </w:pPr>
+      <w:r>
+        <w:rPr>
+          <w:rFonts w:ascii="Consolas" w:cs="Consolas" w:eastAsia="Consolas" w:hAnsi="Consolas"/>
+          <w:color w:val="334155"/>
+          <w:sz w:val="17"/>
+          <w:szCs w:val="17"/>
+        </w:rPr>
+        <w:t xml:space="preserve">  "metric": "budget_threshold",</w:t>
+      </w:r>
+    </w:p>
+    <w:p>
+      <w:pPr>
+        <w:shd w:fill="F8FAFC" w:color="F8FAFC" w:val="solid"/>
+        <w:spacing w:after="0"/>
+        <w:ind w:left="200"/>
+      </w:pPr>
+      <w:r>
+        <w:rPr>
+          <w:rFonts w:ascii="Consolas" w:cs="Consolas" w:eastAsia="Consolas" w:hAnsi="Consolas"/>
+          <w:color w:val="334155"/>
+          <w:sz w:val="17"/>
+          <w:szCs w:val="17"/>
+        </w:rPr>
+        <w:t xml:space="preserve">  "operator": "&gt;",</w:t>
+      </w:r>
+    </w:p>
+    <w:p>
+      <w:pPr>
+        <w:shd w:fill="F8FAFC" w:color="F8FAFC" w:val="solid"/>
+        <w:spacing w:after="0"/>
+        <w:ind w:left="200"/>
+      </w:pPr>
+      <w:r>
+        <w:rPr>
+          <w:rFonts w:ascii="Consolas" w:cs="Consolas" w:eastAsia="Consolas" w:hAnsi="Consolas"/>
+          <w:color w:val="334155"/>
+          <w:sz w:val="17"/>
+          <w:szCs w:val="17"/>
+        </w:rPr>
+        <w:t xml:space="preserve">  "threshold": "daily:5000",</w:t>
+      </w:r>
+    </w:p>
+    <w:p>
+      <w:pPr>
+        <w:shd w:fill="F8FAFC" w:color="F8FAFC" w:val="solid"/>
+        <w:spacing w:after="0"/>
+        <w:ind w:left="200"/>
+      </w:pPr>
+      <w:r>
+        <w:rPr>
+          <w:rFonts w:ascii="Consolas" w:cs="Consolas" w:eastAsia="Consolas" w:hAnsi="Consolas"/>
+          <w:color w:val="334155"/>
+          <w:sz w:val="17"/>
+          <w:szCs w:val="17"/>
+        </w:rPr>
+        <w:t xml:space="preserve">  "alert_name": "Low daily budget"</w:t>
+      </w:r>
+    </w:p>
+    <w:p>
+      <w:pPr>
+        <w:shd w:fill="F8FAFC" w:color="F8FAFC" w:val="solid"/>
+        <w:spacing w:after="0"/>
+        <w:ind w:left="200"/>
+      </w:pPr>
+      <w:r>
+        <w:rPr>
+          <w:rFonts w:ascii="Consolas" w:cs="Consolas" w:eastAsia="Consolas" w:hAnsi="Consolas"/>
+          <w:color w:val="334155"/>
+          <w:sz w:val="17"/>
+          <w:szCs w:val="17"/>
+        </w:rPr>
+        <w:t xml:space="preserve">}</w:t>
+      </w:r>
+    </w:p>
+    <w:p>
+      <w:pPr>
+        <w:spacing w:after="120"/>
+      </w:pPr>
+    </w:p>
+    <w:p>
+      <w:pPr>
+        <w:pStyle w:val="Heading3"/>
+        <w:spacing w:after="120" w:before="240"/>
+      </w:pPr>
+      <w:r>
+        <w:rPr>
+          <w:rFonts w:ascii="Calibri" w:cs="Calibri" w:eastAsia="Calibri" w:hAnsi="Calibri"/>
+          <w:b/>
+          <w:bCs/>
+        </w:rPr>
+        <w:t xml:space="preserve">PATCH /rules/:id</w:t>
+      </w:r>
+    </w:p>
+    <w:p>
+      <w:pPr>
+        <w:spacing w:after="120"/>
+      </w:pPr>
+      <w:r>
+        <w:rPr>
+          <w:rFonts w:ascii="Calibri" w:cs="Calibri" w:eastAsia="Calibri" w:hAnsi="Calibri"/>
+          <w:sz w:val="20"/>
+          <w:szCs w:val="20"/>
+        </w:rPr>
+        <w:t xml:space="preserve">Update a rule. Backend verifies workspace access via the rule's workspace_id.</w:t>
+      </w:r>
+    </w:p>
+    <w:p>
+      <w:pPr>
+        <w:spacing w:after="120"/>
+      </w:pPr>
+      <w:r>
+        <w:rPr>
+          <w:rFonts w:ascii="Calibri" w:cs="Calibri" w:eastAsia="Calibri" w:hAnsi="Calibri"/>
+          <w:b/>
+          <w:bCs/>
+          <w:sz w:val="20"/>
+          <w:szCs w:val="20"/>
+        </w:rPr>
+        <w:t xml:space="preserve">Auth:</w:t>
+      </w:r>
+      <w:r>
+        <w:rPr>
+          <w:rFonts w:ascii="Calibri" w:cs="Calibri" w:eastAsia="Calibri" w:hAnsi="Calibri"/>
+          <w:sz w:val="20"/>
+          <w:szCs w:val="20"/>
+        </w:rPr>
+        <w:t xml:space="preserve"> Workspace access</w:t>
+      </w:r>
+    </w:p>
+    <w:p>
+      <w:pPr>
+        <w:spacing w:after="120"/>
+      </w:pPr>
+      <w:r>
+        <w:rPr>
+          <w:rFonts w:ascii="Calibri" w:cs="Calibri" w:eastAsia="Calibri" w:hAnsi="Calibri"/>
+          <w:b/>
+          <w:bCs/>
+          <w:sz w:val="20"/>
+          <w:szCs w:val="20"/>
+        </w:rPr>
+        <w:t xml:space="preserve">Request body:</w:t>
+      </w:r>
+      <w:r>
+        <w:rPr>
+          <w:rFonts w:ascii="Calibri" w:cs="Calibri" w:eastAsia="Calibri" w:hAnsi="Calibri"/>
+          <w:sz w:val="20"/>
+          <w:szCs w:val="20"/>
+        </w:rPr>
+        <w:t xml:space="preserve"> Any rule fields to update.</w:t>
+      </w:r>
+    </w:p>
+    <w:p>
+      <w:pPr>
+        <w:pStyle w:val="Heading3"/>
+        <w:spacing w:after="120" w:before="240"/>
+      </w:pPr>
+      <w:r>
+        <w:rPr>
+          <w:rFonts w:ascii="Calibri" w:cs="Calibri" w:eastAsia="Calibri" w:hAnsi="Calibri"/>
+          <w:b/>
+          <w:bCs/>
+        </w:rPr>
+        <w:t xml:space="preserve">DELETE /rules/:id</w:t>
+      </w:r>
+    </w:p>
+    <w:p>
+      <w:pPr>
+        <w:spacing w:after="120"/>
+      </w:pPr>
+      <w:r>
+        <w:rPr>
+          <w:rFonts w:ascii="Calibri" w:cs="Calibri" w:eastAsia="Calibri" w:hAnsi="Calibri"/>
+          <w:sz w:val="20"/>
+          <w:szCs w:val="20"/>
+        </w:rPr>
+        <w:t xml:space="preserve">Delete a rule.</w:t>
+      </w:r>
+    </w:p>
+    <w:p>
+      <w:pPr>
+        <w:spacing w:after="120"/>
+      </w:pPr>
+      <w:r>
+        <w:rPr>
+          <w:rFonts w:ascii="Calibri" w:cs="Calibri" w:eastAsia="Calibri" w:hAnsi="Calibri"/>
+          <w:b/>
+          <w:bCs/>
+          <w:sz w:val="20"/>
+          <w:szCs w:val="20"/>
+        </w:rPr>
+        <w:t xml:space="preserve">Auth:</w:t>
+      </w:r>
+      <w:r>
+        <w:rPr>
+          <w:rFonts w:ascii="Calibri" w:cs="Calibri" w:eastAsia="Calibri" w:hAnsi="Calibri"/>
+          <w:sz w:val="20"/>
+          <w:szCs w:val="20"/>
+        </w:rPr>
+        <w:t xml:space="preserve"> Workspace access</w:t>
+      </w:r>
+    </w:p>
+    <w:p>
+      <w:pPr>
+        <w:pStyle w:val="Heading3"/>
+        <w:spacing w:after="120" w:before="240"/>
+      </w:pPr>
+      <w:r>
+        <w:rPr>
+          <w:rFonts w:ascii="Calibri" w:cs="Calibri" w:eastAsia="Calibri" w:hAnsi="Calibri"/>
+          <w:b/>
+          <w:bCs/>
+        </w:rPr>
+        <w:t xml:space="preserve">GET /all-rules</w:t>
+      </w:r>
+    </w:p>
+    <w:p>
+      <w:pPr>
+        <w:spacing w:after="120"/>
+      </w:pPr>
+      <w:r>
+        <w:rPr>
+          <w:rFonts w:ascii="Calibri" w:cs="Calibri" w:eastAsia="Calibri" w:hAnsi="Calibri"/>
+          <w:sz w:val="20"/>
+          <w:szCs w:val="20"/>
+        </w:rPr>
+        <w:t xml:space="preserve">All rules across all workspaces (with workspace name join).</w:t>
+      </w:r>
+    </w:p>
+    <w:p>
+      <w:pPr>
+        <w:spacing w:after="120"/>
+      </w:pPr>
+      <w:r>
+        <w:rPr>
+          <w:rFonts w:ascii="Calibri" w:cs="Calibri" w:eastAsia="Calibri" w:hAnsi="Calibri"/>
+          <w:b/>
+          <w:bCs/>
+          <w:sz w:val="20"/>
+          <w:szCs w:val="20"/>
+        </w:rPr>
+        <w:t xml:space="preserve">Auth:</w:t>
+      </w:r>
+      <w:r>
+        <w:rPr>
+          <w:rFonts w:ascii="Calibri" w:cs="Calibri" w:eastAsia="Calibri" w:hAnsi="Calibri"/>
+          <w:sz w:val="20"/>
+          <w:szCs w:val="20"/>
+        </w:rPr>
+        <w:t xml:space="preserve"> Super admin</w:t>
+      </w:r>
+    </w:p>
+    <w:p>
+      <w:pPr>
+        <w:pStyle w:val="Heading3"/>
+        <w:spacing w:after="120" w:before="240"/>
+      </w:pPr>
+      <w:r>
+        <w:rPr>
+          <w:rFonts w:ascii="Calibri" w:cs="Calibri" w:eastAsia="Calibri" w:hAnsi="Calibri"/>
+          <w:b/>
+          <w:bCs/>
+        </w:rPr>
+        <w:t xml:space="preserve">GET /all-alerts</w:t>
+      </w:r>
+    </w:p>
+    <w:p>
+      <w:pPr>
+        <w:spacing w:after="120"/>
+      </w:pPr>
+      <w:r>
+        <w:rPr>
+          <w:rFonts w:ascii="Calibri" w:cs="Calibri" w:eastAsia="Calibri" w:hAnsi="Calibri"/>
+          <w:sz w:val="20"/>
+          <w:szCs w:val="20"/>
+        </w:rPr>
+        <w:t xml:space="preserve">All alerts across all workspaces (limit 200).</w:t>
+      </w:r>
+    </w:p>
+    <w:p>
+      <w:pPr>
+        <w:spacing w:after="120"/>
+      </w:pPr>
+      <w:r>
+        <w:rPr>
+          <w:rFonts w:ascii="Calibri" w:cs="Calibri" w:eastAsia="Calibri" w:hAnsi="Calibri"/>
+          <w:b/>
+          <w:bCs/>
+          <w:sz w:val="20"/>
+          <w:szCs w:val="20"/>
+        </w:rPr>
+        <w:t xml:space="preserve">Auth:</w:t>
+      </w:r>
+      <w:r>
+        <w:rPr>
+          <w:rFonts w:ascii="Calibri" w:cs="Calibri" w:eastAsia="Calibri" w:hAnsi="Calibri"/>
+          <w:sz w:val="20"/>
+          <w:szCs w:val="20"/>
+        </w:rPr>
+        <w:t xml:space="preserve"> Super admin</w:t>
+      </w:r>
+    </w:p>
+    <w:p>
+      <w:pPr>
+        <w:pStyle w:val="Heading3"/>
+        <w:spacing w:after="120" w:before="240"/>
+      </w:pPr>
+      <w:r>
+        <w:rPr>
+          <w:rFonts w:ascii="Calibri" w:cs="Calibri" w:eastAsia="Calibri" w:hAnsi="Calibri"/>
+          <w:b/>
+          <w:bCs/>
+        </w:rPr>
+        <w:t xml:space="preserve">GET /cron-runs</w:t>
+      </w:r>
+    </w:p>
+    <w:p>
+      <w:pPr>
+        <w:spacing w:after="120"/>
+      </w:pPr>
+      <w:r>
+        <w:rPr>
+          <w:rFonts w:ascii="Calibri" w:cs="Calibri" w:eastAsia="Calibri" w:hAnsi="Calibri"/>
+          <w:sz w:val="20"/>
+          <w:szCs w:val="20"/>
+        </w:rPr>
+        <w:t xml:space="preserve">Cron execution history.</w:t>
+      </w:r>
+    </w:p>
+    <w:p>
+      <w:pPr>
+        <w:spacing w:after="120"/>
+      </w:pPr>
+      <w:r>
+        <w:rPr>
+          <w:rFonts w:ascii="Calibri" w:cs="Calibri" w:eastAsia="Calibri" w:hAnsi="Calibri"/>
+          <w:b/>
+          <w:bCs/>
+          <w:sz w:val="20"/>
+          <w:szCs w:val="20"/>
+        </w:rPr>
+        <w:t xml:space="preserve">Auth:</w:t>
+      </w:r>
+      <w:r>
+        <w:rPr>
+          <w:rFonts w:ascii="Calibri" w:cs="Calibri" w:eastAsia="Calibri" w:hAnsi="Calibri"/>
+          <w:sz w:val="20"/>
+          <w:szCs w:val="20"/>
+        </w:rPr>
+        <w:t xml:space="preserve"> Authenticated</w:t>
+      </w:r>
+    </w:p>
+    <w:p>
+      <w:pPr>
+        <w:spacing w:after="120"/>
+      </w:pPr>
+      <w:r>
+        <w:rPr>
+          <w:rFonts w:ascii="Calibri" w:cs="Calibri" w:eastAsia="Calibri" w:hAnsi="Calibri"/>
+          <w:b/>
+          <w:bCs/>
+          <w:sz w:val="20"/>
+          <w:szCs w:val="20"/>
+        </w:rPr>
+        <w:t xml:space="preserve">Query params:</w:t>
+      </w:r>
+    </w:p>
+    <w:p>
+      <w:pPr>
+        <w:pStyle w:val="ListParagraph"/>
+        <w:numPr>
+          <w:ilvl w:val="0"/>
+          <w:numId w:val="1"/>
+        </w:numPr>
+        <w:spacing w:after="60"/>
+      </w:pPr>
+      <w:r>
+        <w:rPr>
+          <w:rFonts w:ascii="Consolas" w:cs="Consolas" w:eastAsia="Consolas" w:hAnsi="Consolas"/>
+          <w:sz w:val="18"/>
+          <w:szCs w:val="18"/>
+          <w:shd w:fill="F1F5F9" w:color="F1F5F9" w:val="solid"/>
+        </w:rPr>
+        <w:t xml:space="preserve">limit</w:t>
+      </w:r>
+      <w:r>
+        <w:rPr>
+          <w:rFonts w:ascii="Calibri" w:cs="Calibri" w:eastAsia="Calibri" w:hAnsi="Calibri"/>
+          <w:sz w:val="20"/>
+          <w:szCs w:val="20"/>
+        </w:rPr>
+        <w:t xml:space="preserve"> (optional, default 20)</w:t>
+      </w:r>
+    </w:p>
+    <w:p>
+      <w:pPr>
+        <w:pStyle w:val="Heading3"/>
+        <w:spacing w:after="120" w:before="240"/>
+      </w:pPr>
+      <w:r>
+        <w:rPr>
+          <w:rFonts w:ascii="Calibri" w:cs="Calibri" w:eastAsia="Calibri" w:hAnsi="Calibri"/>
+          <w:b/>
+          <w:bCs/>
+        </w:rPr>
+        <w:t xml:space="preserve">GET /audit-log</w:t>
+      </w:r>
+    </w:p>
+    <w:p>
+      <w:pPr>
+        <w:spacing w:after="120"/>
+      </w:pPr>
+      <w:r>
+        <w:rPr>
+          <w:rFonts w:ascii="Calibri" w:cs="Calibri" w:eastAsia="Calibri" w:hAnsi="Calibri"/>
+          <w:sz w:val="20"/>
+          <w:szCs w:val="20"/>
+        </w:rPr>
+        <w:t xml:space="preserve">Rule audit log entries across all workspaces.</w:t>
+      </w:r>
+    </w:p>
+    <w:p>
+      <w:pPr>
+        <w:spacing w:after="120"/>
+      </w:pPr>
+      <w:r>
+        <w:rPr>
+          <w:rFonts w:ascii="Calibri" w:cs="Calibri" w:eastAsia="Calibri" w:hAnsi="Calibri"/>
+          <w:b/>
+          <w:bCs/>
+          <w:sz w:val="20"/>
+          <w:szCs w:val="20"/>
+        </w:rPr>
+        <w:t xml:space="preserve">Auth:</w:t>
+      </w:r>
+      <w:r>
+        <w:rPr>
+          <w:rFonts w:ascii="Calibri" w:cs="Calibri" w:eastAsia="Calibri" w:hAnsi="Calibri"/>
+          <w:sz w:val="20"/>
+          <w:szCs w:val="20"/>
+        </w:rPr>
+        <w:t xml:space="preserve"> Super admin</w:t>
+      </w:r>
+    </w:p>
+    <w:p>
+      <w:pPr>
+        <w:spacing w:after="120"/>
+      </w:pPr>
+      <w:r>
+        <w:rPr>
+          <w:rFonts w:ascii="Calibri" w:cs="Calibri" w:eastAsia="Calibri" w:hAnsi="Calibri"/>
+          <w:b/>
+          <w:bCs/>
+          <w:sz w:val="20"/>
+          <w:szCs w:val="20"/>
+        </w:rPr>
+        <w:t xml:space="preserve">Query params:</w:t>
+      </w:r>
+    </w:p>
+    <w:p>
+      <w:pPr>
+        <w:pStyle w:val="ListParagraph"/>
+        <w:numPr>
+          <w:ilvl w:val="0"/>
+          <w:numId w:val="1"/>
+        </w:numPr>
+        <w:spacing w:after="60"/>
+      </w:pPr>
+      <w:r>
+        <w:rPr>
+          <w:rFonts w:ascii="Consolas" w:cs="Consolas" w:eastAsia="Consolas" w:hAnsi="Consolas"/>
+          <w:sz w:val="18"/>
+          <w:szCs w:val="18"/>
+          <w:shd w:fill="F1F5F9" w:color="F1F5F9" w:val="solid"/>
+        </w:rPr>
+        <w:t xml:space="preserve">limit</w:t>
+      </w:r>
+      <w:r>
+        <w:rPr>
+          <w:rFonts w:ascii="Calibri" w:cs="Calibri" w:eastAsia="Calibri" w:hAnsi="Calibri"/>
+          <w:sz w:val="20"/>
+          <w:szCs w:val="20"/>
+        </w:rPr>
+        <w:t xml:space="preserve"> (optional, default 300)</w:t>
+      </w:r>
+    </w:p>
+    <w:p>
+      <w:pPr>
+        <w:pStyle w:val="Heading3"/>
+        <w:spacing w:after="120" w:before="240"/>
+      </w:pPr>
+      <w:r>
+        <w:rPr>
+          <w:rFonts w:ascii="Calibri" w:cs="Calibri" w:eastAsia="Calibri" w:hAnsi="Calibri"/>
+          <w:b/>
+          <w:bCs/>
+        </w:rPr>
+        <w:t xml:space="preserve">GET /invitations</w:t>
+      </w:r>
+    </w:p>
+    <w:p>
+      <w:pPr>
+        <w:spacing w:after="120"/>
+      </w:pPr>
+      <w:r>
+        <w:rPr>
+          <w:rFonts w:ascii="Calibri" w:cs="Calibri" w:eastAsia="Calibri" w:hAnsi="Calibri"/>
+          <w:sz w:val="20"/>
+          <w:szCs w:val="20"/>
+        </w:rPr>
+        <w:t xml:space="preserve">All invitation records.</w:t>
+      </w:r>
+    </w:p>
+    <w:p>
+      <w:pPr>
+        <w:spacing w:after="120"/>
+      </w:pPr>
+      <w:r>
+        <w:rPr>
+          <w:rFonts w:ascii="Calibri" w:cs="Calibri" w:eastAsia="Calibri" w:hAnsi="Calibri"/>
+          <w:b/>
+          <w:bCs/>
+          <w:sz w:val="20"/>
+          <w:szCs w:val="20"/>
+        </w:rPr>
+        <w:t xml:space="preserve">Auth:</w:t>
+      </w:r>
+      <w:r>
+        <w:rPr>
+          <w:rFonts w:ascii="Calibri" w:cs="Calibri" w:eastAsia="Calibri" w:hAnsi="Calibri"/>
+          <w:sz w:val="20"/>
+          <w:szCs w:val="20"/>
+        </w:rPr>
+        <w:t xml:space="preserve"> Super admin</w:t>
+      </w:r>
+    </w:p>
+    <w:p>
+      <w:pPr>
+        <w:pStyle w:val="Heading3"/>
+        <w:spacing w:after="120" w:before="240"/>
+      </w:pPr>
+      <w:r>
+        <w:rPr>
+          <w:rFonts w:ascii="Calibri" w:cs="Calibri" w:eastAsia="Calibri" w:hAnsi="Calibri"/>
+          <w:b/>
+          <w:bCs/>
+        </w:rPr>
+        <w:t xml:space="preserve">GET /user-profiles</w:t>
+      </w:r>
+    </w:p>
+    <w:p>
+      <w:pPr>
+        <w:spacing w:after="120"/>
+      </w:pPr>
+      <w:r>
+        <w:rPr>
+          <w:rFonts w:ascii="Calibri" w:cs="Calibri" w:eastAsia="Calibri" w:hAnsi="Calibri"/>
+          <w:sz w:val="20"/>
+          <w:szCs w:val="20"/>
+        </w:rPr>
+        <w:t xml:space="preserve">All user profiles (id, role, workspace_id).</w:t>
+      </w:r>
+    </w:p>
+    <w:p>
+      <w:pPr>
+        <w:spacing w:after="120"/>
+      </w:pPr>
+      <w:r>
+        <w:rPr>
+          <w:rFonts w:ascii="Calibri" w:cs="Calibri" w:eastAsia="Calibri" w:hAnsi="Calibri"/>
+          <w:b/>
+          <w:bCs/>
+          <w:sz w:val="20"/>
+          <w:szCs w:val="20"/>
+        </w:rPr>
+        <w:t xml:space="preserve">Auth:</w:t>
+      </w:r>
+      <w:r>
+        <w:rPr>
+          <w:rFonts w:ascii="Calibri" w:cs="Calibri" w:eastAsia="Calibri" w:hAnsi="Calibri"/>
+          <w:sz w:val="20"/>
+          <w:szCs w:val="20"/>
+        </w:rPr>
+        <w:t xml:space="preserve"> Super admin</w:t>
+      </w:r>
+    </w:p>
+    <w:p>
+      <w:pPr>
+        <w:pStyle w:val="Heading3"/>
+        <w:spacing w:after="120" w:before="240"/>
+      </w:pPr>
+      <w:r>
+        <w:rPr>
+          <w:rFonts w:ascii="Calibri" w:cs="Calibri" w:eastAsia="Calibri" w:hAnsi="Calibri"/>
+          <w:b/>
+          <w:bCs/>
+        </w:rPr>
+        <w:t xml:space="preserve">GET /ad-account-map</w:t>
+      </w:r>
+    </w:p>
+    <w:p>
+      <w:pPr>
+        <w:spacing w:after="120"/>
+      </w:pPr>
+      <w:r>
+        <w:rPr>
+          <w:rFonts w:ascii="Calibri" w:cs="Calibri" w:eastAsia="Calibri" w:hAnsi="Calibri"/>
+          <w:sz w:val="20"/>
+          <w:szCs w:val="20"/>
+        </w:rPr>
+        <w:t xml:space="preserve">Ad account ID to name mapping for display purposes.</w:t>
+      </w:r>
+    </w:p>
+    <w:p>
+      <w:pPr>
+        <w:spacing w:after="120"/>
+      </w:pPr>
+      <w:r>
+        <w:rPr>
+          <w:rFonts w:ascii="Calibri" w:cs="Calibri" w:eastAsia="Calibri" w:hAnsi="Calibri"/>
+          <w:b/>
+          <w:bCs/>
+          <w:sz w:val="20"/>
+          <w:szCs w:val="20"/>
+        </w:rPr>
+        <w:t xml:space="preserve">Auth:</w:t>
+      </w:r>
+      <w:r>
+        <w:rPr>
+          <w:rFonts w:ascii="Calibri" w:cs="Calibri" w:eastAsia="Calibri" w:hAnsi="Calibri"/>
+          <w:sz w:val="20"/>
+          <w:szCs w:val="20"/>
+        </w:rPr>
+        <w:t xml:space="preserve"> Authenticated</w:t>
+      </w:r>
+    </w:p>
+    <w:p>
+      <w:pPr>
+        <w:pStyle w:val="Heading3"/>
+        <w:spacing w:after="120" w:before="240"/>
+      </w:pPr>
+      <w:r>
+        <w:rPr>
+          <w:rFonts w:ascii="Calibri" w:cs="Calibri" w:eastAsia="Calibri" w:hAnsi="Calibri"/>
+          <w:b/>
+          <w:bCs/>
+        </w:rPr>
+        <w:t xml:space="preserve">GET /admin-dashboard</w:t>
+      </w:r>
+    </w:p>
+    <w:p>
+      <w:pPr>
+        <w:spacing w:after="120"/>
+      </w:pPr>
+      <w:r>
+        <w:rPr>
+          <w:rFonts w:ascii="Calibri" w:cs="Calibri" w:eastAsia="Calibri" w:hAnsi="Calibri"/>
+          <w:sz w:val="20"/>
+          <w:szCs w:val="20"/>
+        </w:rPr>
+        <w:t xml:space="preserve">Aggregated data for the admin overview page in a single request. Returns</w:t>
+      </w:r>
+    </w:p>
+    <w:p>
+      <w:pPr>
+        <w:spacing w:after="120"/>
+      </w:pPr>
+      <w:r>
+        <w:rPr>
+          <w:rFonts w:ascii="Calibri" w:cs="Calibri" w:eastAsia="Calibri" w:hAnsi="Calibri"/>
+          <w:sz w:val="20"/>
+          <w:szCs w:val="20"/>
+        </w:rPr>
+        <w:t xml:space="preserve">workspaces, sync runs, active alerts, recent activity, rule count, campaigns,</w:t>
+      </w:r>
+    </w:p>
+    <w:p>
+      <w:pPr>
+        <w:spacing w:after="120"/>
+      </w:pPr>
+      <w:r>
+        <w:rPr>
+          <w:rFonts w:ascii="Calibri" w:cs="Calibri" w:eastAsia="Calibri" w:hAnsi="Calibri"/>
+          <w:sz w:val="20"/>
+          <w:szCs w:val="20"/>
+        </w:rPr>
+        <w:t xml:space="preserve">and all rules.</w:t>
+      </w:r>
+    </w:p>
+    <w:p>
+      <w:pPr>
+        <w:spacing w:after="120"/>
+      </w:pPr>
+      <w:r>
+        <w:rPr>
+          <w:rFonts w:ascii="Calibri" w:cs="Calibri" w:eastAsia="Calibri" w:hAnsi="Calibri"/>
+          <w:b/>
+          <w:bCs/>
+          <w:sz w:val="20"/>
+          <w:szCs w:val="20"/>
+        </w:rPr>
+        <w:t xml:space="preserve">Auth:</w:t>
+      </w:r>
+      <w:r>
+        <w:rPr>
+          <w:rFonts w:ascii="Calibri" w:cs="Calibri" w:eastAsia="Calibri" w:hAnsi="Calibri"/>
+          <w:sz w:val="20"/>
+          <w:szCs w:val="20"/>
+        </w:rPr>
+        <w:t xml:space="preserve"> Super admin</w:t>
+      </w:r>
+    </w:p>
+    <w:p>
+      <w:pPr>
+        <w:spacing w:after="120"/>
+      </w:pPr>
+      <w:r>
+        <w:rPr>
+          <w:rFonts w:ascii="Calibri" w:cs="Calibri" w:eastAsia="Calibri" w:hAnsi="Calibri"/>
+          <w:b/>
+          <w:bCs/>
+          <w:sz w:val="20"/>
+          <w:szCs w:val="20"/>
+        </w:rPr>
+        <w:t xml:space="preserve">Response (200):</w:t>
+      </w:r>
+    </w:p>
+    <w:p>
+      <w:pPr>
+        <w:shd w:fill="F8FAFC" w:color="F8FAFC" w:val="solid"/>
+        <w:spacing w:after="0"/>
+        <w:ind w:left="200"/>
+      </w:pPr>
+      <w:r>
+        <w:rPr>
+          <w:rFonts w:ascii="Consolas" w:cs="Consolas" w:eastAsia="Consolas" w:hAnsi="Consolas"/>
+          <w:color w:val="334155"/>
+          <w:sz w:val="17"/>
+          <w:szCs w:val="17"/>
+        </w:rPr>
+        <w:t xml:space="preserve">{</w:t>
+      </w:r>
+    </w:p>
+    <w:p>
+      <w:pPr>
+        <w:shd w:fill="F8FAFC" w:color="F8FAFC" w:val="solid"/>
+        <w:spacing w:after="0"/>
+        <w:ind w:left="200"/>
+      </w:pPr>
+      <w:r>
+        <w:rPr>
+          <w:rFonts w:ascii="Consolas" w:cs="Consolas" w:eastAsia="Consolas" w:hAnsi="Consolas"/>
+          <w:color w:val="334155"/>
+          <w:sz w:val="17"/>
+          <w:szCs w:val="17"/>
+        </w:rPr>
+        <w:t xml:space="preserve">  "workspaces": [...],</w:t>
+      </w:r>
+    </w:p>
+    <w:p>
+      <w:pPr>
+        <w:shd w:fill="F8FAFC" w:color="F8FAFC" w:val="solid"/>
+        <w:spacing w:after="0"/>
+        <w:ind w:left="200"/>
+      </w:pPr>
+      <w:r>
+        <w:rPr>
+          <w:rFonts w:ascii="Consolas" w:cs="Consolas" w:eastAsia="Consolas" w:hAnsi="Consolas"/>
+          <w:color w:val="334155"/>
+          <w:sz w:val="17"/>
+          <w:szCs w:val="17"/>
+        </w:rPr>
+        <w:t xml:space="preserve">  "syncRuns": [...],</w:t>
+      </w:r>
+    </w:p>
+    <w:p>
+      <w:pPr>
+        <w:shd w:fill="F8FAFC" w:color="F8FAFC" w:val="solid"/>
+        <w:spacing w:after="0"/>
+        <w:ind w:left="200"/>
+      </w:pPr>
+      <w:r>
+        <w:rPr>
+          <w:rFonts w:ascii="Consolas" w:cs="Consolas" w:eastAsia="Consolas" w:hAnsi="Consolas"/>
+          <w:color w:val="334155"/>
+          <w:sz w:val="17"/>
+          <w:szCs w:val="17"/>
+        </w:rPr>
+        <w:t xml:space="preserve">  "alerts": [...],</w:t>
+      </w:r>
+    </w:p>
+    <w:p>
+      <w:pPr>
+        <w:shd w:fill="F8FAFC" w:color="F8FAFC" w:val="solid"/>
+        <w:spacing w:after="0"/>
+        <w:ind w:left="200"/>
+      </w:pPr>
+      <w:r>
+        <w:rPr>
+          <w:rFonts w:ascii="Consolas" w:cs="Consolas" w:eastAsia="Consolas" w:hAnsi="Consolas"/>
+          <w:color w:val="334155"/>
+          <w:sz w:val="17"/>
+          <w:szCs w:val="17"/>
+        </w:rPr>
+        <w:t xml:space="preserve">  "activity": [...],</w:t>
+      </w:r>
+    </w:p>
+    <w:p>
+      <w:pPr>
+        <w:shd w:fill="F8FAFC" w:color="F8FAFC" w:val="solid"/>
+        <w:spacing w:after="0"/>
+        <w:ind w:left="200"/>
+      </w:pPr>
+      <w:r>
+        <w:rPr>
+          <w:rFonts w:ascii="Consolas" w:cs="Consolas" w:eastAsia="Consolas" w:hAnsi="Consolas"/>
+          <w:color w:val="334155"/>
+          <w:sz w:val="17"/>
+          <w:szCs w:val="17"/>
+        </w:rPr>
+        <w:t xml:space="preserve">  "ruleCount": 12,</w:t>
+      </w:r>
+    </w:p>
+    <w:p>
+      <w:pPr>
+        <w:shd w:fill="F8FAFC" w:color="F8FAFC" w:val="solid"/>
+        <w:spacing w:after="0"/>
+        <w:ind w:left="200"/>
+      </w:pPr>
+      <w:r>
+        <w:rPr>
+          <w:rFonts w:ascii="Consolas" w:cs="Consolas" w:eastAsia="Consolas" w:hAnsi="Consolas"/>
+          <w:color w:val="334155"/>
+          <w:sz w:val="17"/>
+          <w:szCs w:val="17"/>
+        </w:rPr>
+        <w:t xml:space="preserve">  "campaigns": [...],</w:t>
+      </w:r>
+    </w:p>
+    <w:p>
+      <w:pPr>
+        <w:shd w:fill="F8FAFC" w:color="F8FAFC" w:val="solid"/>
+        <w:spacing w:after="0"/>
+        <w:ind w:left="200"/>
+      </w:pPr>
+      <w:r>
+        <w:rPr>
+          <w:rFonts w:ascii="Consolas" w:cs="Consolas" w:eastAsia="Consolas" w:hAnsi="Consolas"/>
+          <w:color w:val="334155"/>
+          <w:sz w:val="17"/>
+          <w:szCs w:val="17"/>
+        </w:rPr>
+        <w:t xml:space="preserve">  "allRules": [...]</w:t>
+      </w:r>
+    </w:p>
+    <w:p>
+      <w:pPr>
+        <w:shd w:fill="F8FAFC" w:color="F8FAFC" w:val="solid"/>
+        <w:spacing w:after="0"/>
+        <w:ind w:left="200"/>
+      </w:pPr>
+      <w:r>
+        <w:rPr>
+          <w:rFonts w:ascii="Consolas" w:cs="Consolas" w:eastAsia="Consolas" w:hAnsi="Consolas"/>
+          <w:color w:val="334155"/>
+          <w:sz w:val="17"/>
+          <w:szCs w:val="17"/>
+        </w:rPr>
+        <w:t xml:space="preserve">}</w:t>
+      </w:r>
+    </w:p>
+    <w:p>
+      <w:pPr>
+        <w:spacing w:after="120"/>
+      </w:pPr>
+    </w:p>
+    <w:p>
+      <w:pPr>
+        <w:pStyle w:val="Heading2"/>
+        <w:spacing w:after="120" w:before="240"/>
+      </w:pPr>
+      <w:r>
+        <w:rPr>
+          <w:rFonts w:ascii="Calibri" w:cs="Calibri" w:eastAsia="Calibri" w:hAnsi="Calibri"/>
+          <w:b/>
+          <w:bCs/>
+        </w:rPr>
+        <w:t xml:space="preserve">Frontend API Functions</w:t>
+      </w:r>
+    </w:p>
+    <w:p>
+      <w:pPr>
+        <w:spacing w:after="120"/>
+      </w:pPr>
+      <w:r>
+        <w:rPr>
+          <w:rFonts w:ascii="Calibri" w:cs="Calibri" w:eastAsia="Calibri" w:hAnsi="Calibri"/>
+          <w:sz w:val="20"/>
+          <w:szCs w:val="20"/>
+        </w:rPr>
+        <w:t xml:space="preserve">All functions in </w:t>
+      </w:r>
+      <w:r>
+        <w:rPr>
+          <w:rFonts w:ascii="Consolas" w:cs="Consolas" w:eastAsia="Consolas" w:hAnsi="Consolas"/>
+          <w:sz w:val="18"/>
+          <w:szCs w:val="18"/>
+          <w:shd w:fill="F1F5F9" w:color="F1F5F9" w:val="solid"/>
+        </w:rPr>
         <w:t xml:space="preserve">frontend/src/lib/api.js</w:t>
       </w:r>
       <w:r>
@@ -2902,7 +4951,37 @@
           <w:sz w:val="20"/>
           <w:szCs w:val="20"/>
         </w:rPr>
-        <w:t xml:space="preserve">:</w:t>
+        <w:t xml:space="preserve"> use </w:t>
+      </w:r>
+      <w:r>
+        <w:rPr>
+          <w:rFonts w:ascii="Consolas" w:cs="Consolas" w:eastAsia="Consolas" w:hAnsi="Consolas"/>
+          <w:sz w:val="18"/>
+          <w:szCs w:val="18"/>
+          <w:shd w:fill="F1F5F9" w:color="F1F5F9" w:val="solid"/>
+        </w:rPr>
+        <w:t xml:space="preserve">apiCall()</w:t>
+      </w:r>
+      <w:r>
+        <w:rPr>
+          <w:rFonts w:ascii="Calibri" w:cs="Calibri" w:eastAsia="Calibri" w:hAnsi="Calibri"/>
+          <w:sz w:val="20"/>
+          <w:szCs w:val="20"/>
+        </w:rPr>
+        <w:t xml:space="preserve"> which sends</w:t>
+      </w:r>
+    </w:p>
+    <w:p>
+      <w:pPr>
+        <w:spacing w:after="120"/>
+      </w:pPr>
+      <w:r>
+        <w:rPr>
+          <w:rFonts w:ascii="Calibri" w:cs="Calibri" w:eastAsia="Calibri" w:hAnsi="Calibri"/>
+          <w:sz w:val="20"/>
+          <w:szCs w:val="20"/>
+        </w:rPr>
+        <w:t xml:space="preserve">requests to the backend with the Supabase JWT as authorization:</w:t>
       </w:r>
     </w:p>
     <w:tbl>
@@ -2971,7 +5050,7 @@
                 <w:sz w:val="18"/>
                 <w:szCs w:val="18"/>
               </w:rPr>
-              <w:t xml:space="preserve">Table</w:t>
+              <w:t xml:space="preserve">Backend Endpoint</w:t>
             </w:r>
           </w:p>
         </w:tc>
@@ -3023,6 +5102,78 @@
                 <w:szCs w:val="18"/>
                 <w:shd w:fill="F1F5F9" w:color="F1F5F9" w:val="solid"/>
               </w:rPr>
+              <w:t xml:space="preserve">fetchMyProfile()</w:t>
+            </w:r>
+          </w:p>
+        </w:tc>
+        <w:tc>
+          <w:tcPr>
+            <w:tcBorders>
+              <w:top w:val="single" w:color="CBD5E1" w:sz="1"/>
+              <w:left w:val="single" w:color="CBD5E1" w:sz="1"/>
+              <w:bottom w:val="single" w:color="CBD5E1" w:sz="1"/>
+              <w:right w:val="single" w:color="CBD5E1" w:sz="1"/>
+            </w:tcBorders>
+          </w:tcPr>
+          <w:p>
+            <w:pPr>
+              <w:spacing w:after="40" w:before="40"/>
+            </w:pPr>
+            <w:r>
+              <w:rPr>
+                <w:rFonts w:ascii="Calibri" w:cs="Calibri" w:eastAsia="Calibri" w:hAnsi="Calibri"/>
+                <w:sz w:val="20"/>
+                <w:szCs w:val="20"/>
+              </w:rPr>
+              <w:t xml:space="preserve">GET /me</w:t>
+            </w:r>
+          </w:p>
+        </w:tc>
+        <w:tc>
+          <w:tcPr>
+            <w:tcBorders>
+              <w:top w:val="single" w:color="CBD5E1" w:sz="1"/>
+              <w:left w:val="single" w:color="CBD5E1" w:sz="1"/>
+              <w:bottom w:val="single" w:color="CBD5E1" w:sz="1"/>
+              <w:right w:val="single" w:color="CBD5E1" w:sz="1"/>
+            </w:tcBorders>
+          </w:tcPr>
+          <w:p>
+            <w:pPr>
+              <w:spacing w:after="40" w:before="40"/>
+            </w:pPr>
+            <w:r>
+              <w:rPr>
+                <w:rFonts w:ascii="Calibri" w:cs="Calibri" w:eastAsia="Calibri" w:hAnsi="Calibri"/>
+                <w:sz w:val="20"/>
+                <w:szCs w:val="20"/>
+              </w:rPr>
+              <w:t xml:space="preserve">Current user role + workspace</w:t>
+            </w:r>
+          </w:p>
+        </w:tc>
+      </w:tr>
+      <w:tr>
+        <w:tc>
+          <w:tcPr>
+            <w:tcBorders>
+              <w:top w:val="single" w:color="CBD5E1" w:sz="1"/>
+              <w:left w:val="single" w:color="CBD5E1" w:sz="1"/>
+              <w:bottom w:val="single" w:color="CBD5E1" w:sz="1"/>
+              <w:right w:val="single" w:color="CBD5E1" w:sz="1"/>
+            </w:tcBorders>
+          </w:tcPr>
+          <w:p>
+            <w:pPr>
+              <w:spacing w:after="40" w:before="40"/>
+            </w:pPr>
+            <w:r>
+              <w:rPr>
+                <w:rFonts w:ascii="Consolas" w:cs="Consolas" w:eastAsia="Consolas" w:hAnsi="Consolas"/>
+                <w:sz w:val="18"/>
+                <w:szCs w:val="18"/>
+                <w:shd w:fill="F1F5F9" w:color="F1F5F9" w:val="solid"/>
+              </w:rPr>
               <w:t xml:space="preserve">listWorkspaces()</w:t>
             </w:r>
           </w:p>
@@ -3046,7 +5197,7 @@
                 <w:sz w:val="20"/>
                 <w:szCs w:val="20"/>
               </w:rPr>
-              <w:t xml:space="preserve">workspaces</w:t>
+              <w:t xml:space="preserve">GET /workspaces</w:t>
             </w:r>
           </w:p>
         </w:tc>
@@ -3069,7 +5220,7 @@
                 <w:sz w:val="20"/>
                 <w:szCs w:val="20"/>
               </w:rPr>
-              <w:t xml:space="preserve">All workspaces with ad accounts and user profiles</w:t>
+              <w:t xml:space="preserve">All workspaces</w:t>
             </w:r>
           </w:p>
         </w:tc>
@@ -3118,7 +5269,7 @@
                 <w:sz w:val="20"/>
                 <w:szCs w:val="20"/>
               </w:rPr>
-              <w:t xml:space="preserve">workspaces</w:t>
+              <w:t xml:space="preserve">GET /workspaces/:id</w:t>
             </w:r>
           </w:p>
         </w:tc>
@@ -3141,7 +5292,7 @@
                 <w:sz w:val="20"/>
                 <w:szCs w:val="20"/>
               </w:rPr>
-              <w:t xml:space="preserve">Single workspace with ad accounts</w:t>
+              <w:t xml:space="preserve">Single workspace</w:t>
             </w:r>
           </w:p>
         </w:tc>
@@ -3190,7 +5341,7 @@
                 <w:sz w:val="20"/>
                 <w:szCs w:val="20"/>
               </w:rPr>
-              <w:t xml:space="preserve">workspaces</w:t>
+              <w:t xml:space="preserve">POST /workspaces</w:t>
             </w:r>
           </w:p>
         </w:tc>
@@ -3213,7 +5364,7 @@
                 <w:sz w:val="20"/>
                 <w:szCs w:val="20"/>
               </w:rPr>
-              <w:t xml:space="preserve">Insert new workspace</w:t>
+              <w:t xml:space="preserve">Create workspace</w:t>
             </w:r>
           </w:p>
         </w:tc>
@@ -3262,7 +5413,7 @@
                 <w:sz w:val="20"/>
                 <w:szCs w:val="20"/>
               </w:rPr>
-              <w:t xml:space="preserve">workspaces</w:t>
+              <w:t xml:space="preserve">PATCH /workspaces/:id</w:t>
             </w:r>
           </w:p>
         </w:tc>
@@ -3285,7 +5436,7 @@
                 <w:sz w:val="20"/>
                 <w:szCs w:val="20"/>
               </w:rPr>
-              <w:t xml:space="preserve">Update workspace fields</w:t>
+              <w:t xml:space="preserve">Update workspace</w:t>
             </w:r>
           </w:p>
         </w:tc>
@@ -3334,7 +5485,7 @@
                 <w:sz w:val="20"/>
                 <w:szCs w:val="20"/>
               </w:rPr>
-              <w:t xml:space="preserve">workspace_ad_accounts</w:t>
+              <w:t xml:space="preserve">GET /workspaces/:id/ad-accounts</w:t>
             </w:r>
           </w:p>
         </w:tc>
@@ -3357,7 +5508,7 @@
                 <w:sz w:val="20"/>
                 <w:szCs w:val="20"/>
               </w:rPr>
-              <w:t xml:space="preserve">Ad accounts for a workspace (no token)</w:t>
+              <w:t xml:space="preserve">Workspace ad accounts</w:t>
             </w:r>
           </w:p>
         </w:tc>
@@ -3406,7 +5557,7 @@
                 <w:sz w:val="20"/>
                 <w:szCs w:val="20"/>
               </w:rPr>
-              <w:t xml:space="preserve">validation_rules</w:t>
+              <w:t xml:space="preserve">GET /workspaces/:id/rules</w:t>
             </w:r>
           </w:p>
         </w:tc>
@@ -3429,7 +5580,79 @@
                 <w:sz w:val="20"/>
                 <w:szCs w:val="20"/>
               </w:rPr>
-              <w:t xml:space="preserve">All rules for a workspace</w:t>
+              <w:t xml:space="preserve">Workspace rules</w:t>
+            </w:r>
+          </w:p>
+        </w:tc>
+      </w:tr>
+      <w:tr>
+        <w:tc>
+          <w:tcPr>
+            <w:tcBorders>
+              <w:top w:val="single" w:color="CBD5E1" w:sz="1"/>
+              <w:left w:val="single" w:color="CBD5E1" w:sz="1"/>
+              <w:bottom w:val="single" w:color="CBD5E1" w:sz="1"/>
+              <w:right w:val="single" w:color="CBD5E1" w:sz="1"/>
+            </w:tcBorders>
+          </w:tcPr>
+          <w:p>
+            <w:pPr>
+              <w:spacing w:after="40" w:before="40"/>
+            </w:pPr>
+            <w:r>
+              <w:rPr>
+                <w:rFonts w:ascii="Consolas" w:cs="Consolas" w:eastAsia="Consolas" w:hAnsi="Consolas"/>
+                <w:sz w:val="18"/>
+                <w:szCs w:val="18"/>
+                <w:shd w:fill="F1F5F9" w:color="F1F5F9" w:val="solid"/>
+              </w:rPr>
+              <w:t xml:space="preserve">listAllRules()</w:t>
+            </w:r>
+          </w:p>
+        </w:tc>
+        <w:tc>
+          <w:tcPr>
+            <w:tcBorders>
+              <w:top w:val="single" w:color="CBD5E1" w:sz="1"/>
+              <w:left w:val="single" w:color="CBD5E1" w:sz="1"/>
+              <w:bottom w:val="single" w:color="CBD5E1" w:sz="1"/>
+              <w:right w:val="single" w:color="CBD5E1" w:sz="1"/>
+            </w:tcBorders>
+          </w:tcPr>
+          <w:p>
+            <w:pPr>
+              <w:spacing w:after="40" w:before="40"/>
+            </w:pPr>
+            <w:r>
+              <w:rPr>
+                <w:rFonts w:ascii="Calibri" w:cs="Calibri" w:eastAsia="Calibri" w:hAnsi="Calibri"/>
+                <w:sz w:val="20"/>
+                <w:szCs w:val="20"/>
+              </w:rPr>
+              <w:t xml:space="preserve">GET /all-rules</w:t>
+            </w:r>
+          </w:p>
+        </w:tc>
+        <w:tc>
+          <w:tcPr>
+            <w:tcBorders>
+              <w:top w:val="single" w:color="CBD5E1" w:sz="1"/>
+              <w:left w:val="single" w:color="CBD5E1" w:sz="1"/>
+              <w:bottom w:val="single" w:color="CBD5E1" w:sz="1"/>
+              <w:right w:val="single" w:color="CBD5E1" w:sz="1"/>
+            </w:tcBorders>
+          </w:tcPr>
+          <w:p>
+            <w:pPr>
+              <w:spacing w:after="40" w:before="40"/>
+            </w:pPr>
+            <w:r>
+              <w:rPr>
+                <w:rFonts w:ascii="Calibri" w:cs="Calibri" w:eastAsia="Calibri" w:hAnsi="Calibri"/>
+                <w:sz w:val="20"/>
+                <w:szCs w:val="20"/>
+              </w:rPr>
+              <w:t xml:space="preserve">All rules (admin)</w:t>
             </w:r>
           </w:p>
         </w:tc>
@@ -3478,7 +5701,7 @@
                 <w:sz w:val="20"/>
                 <w:szCs w:val="20"/>
               </w:rPr>
-              <w:t xml:space="preserve">validation_rules</w:t>
+              <w:t xml:space="preserve">POST /rules</w:t>
             </w:r>
           </w:p>
         </w:tc>
@@ -3501,7 +5724,7 @@
                 <w:sz w:val="20"/>
                 <w:szCs w:val="20"/>
               </w:rPr>
-              <w:t xml:space="preserve">Insert new rule</w:t>
+              <w:t xml:space="preserve">Create rule</w:t>
             </w:r>
           </w:p>
         </w:tc>
@@ -3550,7 +5773,7 @@
                 <w:sz w:val="20"/>
                 <w:szCs w:val="20"/>
               </w:rPr>
-              <w:t xml:space="preserve">validation_rules</w:t>
+              <w:t xml:space="preserve">PATCH /rules/:id</w:t>
             </w:r>
           </w:p>
         </w:tc>
@@ -3573,7 +5796,7 @@
                 <w:sz w:val="20"/>
                 <w:szCs w:val="20"/>
               </w:rPr>
-              <w:t xml:space="preserve">Update rule fields</w:t>
+              <w:t xml:space="preserve">Update rule</w:t>
             </w:r>
           </w:p>
         </w:tc>
@@ -3622,7 +5845,7 @@
                 <w:sz w:val="20"/>
                 <w:szCs w:val="20"/>
               </w:rPr>
-              <w:t xml:space="preserve">validation_rules</w:t>
+              <w:t xml:space="preserve">DELETE /rules/:id</w:t>
             </w:r>
           </w:p>
         </w:tc>
@@ -3645,7 +5868,7 @@
                 <w:sz w:val="20"/>
                 <w:szCs w:val="20"/>
               </w:rPr>
-              <w:t xml:space="preserve">Delete a rule</w:t>
+              <w:t xml:space="preserve">Delete rule</w:t>
             </w:r>
           </w:p>
         </w:tc>
@@ -3694,7 +5917,7 @@
                 <w:sz w:val="20"/>
                 <w:szCs w:val="20"/>
               </w:rPr>
-              <w:t xml:space="preserve">validation_rules</w:t>
+              <w:t xml:space="preserve">PATCH /rules/:id</w:t>
             </w:r>
           </w:p>
         </w:tc>
@@ -3717,7 +5940,7 @@
                 <w:sz w:val="20"/>
                 <w:szCs w:val="20"/>
               </w:rPr>
-              <w:t xml:space="preserve">Toggle rule active state</w:t>
+              <w:t xml:space="preserve">Toggle active</w:t>
             </w:r>
           </w:p>
         </w:tc>
@@ -3766,7 +5989,7 @@
                 <w:sz w:val="20"/>
                 <w:szCs w:val="20"/>
               </w:rPr>
-              <w:t xml:space="preserve">alert_log</w:t>
+              <w:t xml:space="preserve">GET /workspaces/:id/alerts</w:t>
             </w:r>
           </w:p>
         </w:tc>
@@ -3789,7 +6012,79 @@
                 <w:sz w:val="20"/>
                 <w:szCs w:val="20"/>
               </w:rPr>
-              <w:t xml:space="preserve">Alerts for a workspace (optional activeOnly filter)</w:t>
+              <w:t xml:space="preserve">Workspace alerts</w:t>
+            </w:r>
+          </w:p>
+        </w:tc>
+      </w:tr>
+      <w:tr>
+        <w:tc>
+          <w:tcPr>
+            <w:tcBorders>
+              <w:top w:val="single" w:color="CBD5E1" w:sz="1"/>
+              <w:left w:val="single" w:color="CBD5E1" w:sz="1"/>
+              <w:bottom w:val="single" w:color="CBD5E1" w:sz="1"/>
+              <w:right w:val="single" w:color="CBD5E1" w:sz="1"/>
+            </w:tcBorders>
+          </w:tcPr>
+          <w:p>
+            <w:pPr>
+              <w:spacing w:after="40" w:before="40"/>
+            </w:pPr>
+            <w:r>
+              <w:rPr>
+                <w:rFonts w:ascii="Consolas" w:cs="Consolas" w:eastAsia="Consolas" w:hAnsi="Consolas"/>
+                <w:sz w:val="18"/>
+                <w:szCs w:val="18"/>
+                <w:shd w:fill="F1F5F9" w:color="F1F5F9" w:val="solid"/>
+              </w:rPr>
+              <w:t xml:space="preserve">listAllAlerts()</w:t>
+            </w:r>
+          </w:p>
+        </w:tc>
+        <w:tc>
+          <w:tcPr>
+            <w:tcBorders>
+              <w:top w:val="single" w:color="CBD5E1" w:sz="1"/>
+              <w:left w:val="single" w:color="CBD5E1" w:sz="1"/>
+              <w:bottom w:val="single" w:color="CBD5E1" w:sz="1"/>
+              <w:right w:val="single" w:color="CBD5E1" w:sz="1"/>
+            </w:tcBorders>
+          </w:tcPr>
+          <w:p>
+            <w:pPr>
+              <w:spacing w:after="40" w:before="40"/>
+            </w:pPr>
+            <w:r>
+              <w:rPr>
+                <w:rFonts w:ascii="Calibri" w:cs="Calibri" w:eastAsia="Calibri" w:hAnsi="Calibri"/>
+                <w:sz w:val="20"/>
+                <w:szCs w:val="20"/>
+              </w:rPr>
+              <w:t xml:space="preserve">GET /all-alerts</w:t>
+            </w:r>
+          </w:p>
+        </w:tc>
+        <w:tc>
+          <w:tcPr>
+            <w:tcBorders>
+              <w:top w:val="single" w:color="CBD5E1" w:sz="1"/>
+              <w:left w:val="single" w:color="CBD5E1" w:sz="1"/>
+              <w:bottom w:val="single" w:color="CBD5E1" w:sz="1"/>
+              <w:right w:val="single" w:color="CBD5E1" w:sz="1"/>
+            </w:tcBorders>
+          </w:tcPr>
+          <w:p>
+            <w:pPr>
+              <w:spacing w:after="40" w:before="40"/>
+            </w:pPr>
+            <w:r>
+              <w:rPr>
+                <w:rFonts w:ascii="Calibri" w:cs="Calibri" w:eastAsia="Calibri" w:hAnsi="Calibri"/>
+                <w:sz w:val="20"/>
+                <w:szCs w:val="20"/>
+              </w:rPr>
+              <w:t xml:space="preserve">All alerts (admin)</w:t>
             </w:r>
           </w:p>
         </w:tc>
@@ -3838,7 +6133,7 @@
                 <w:sz w:val="20"/>
                 <w:szCs w:val="20"/>
               </w:rPr>
-              <w:t xml:space="preserve">entity_cache + validation_rules + alert_log</w:t>
+              <w:t xml:space="preserve">GET /workspaces/:id/campaigns</w:t>
             </w:r>
           </w:p>
         </w:tc>
@@ -3861,7 +6156,79 @@
                 <w:sz w:val="20"/>
                 <w:szCs w:val="20"/>
               </w:rPr>
-              <w:t xml:space="preserve">Enriched campaign tree with rules and violations</w:t>
+              <w:t xml:space="preserve">Enriched campaigns</w:t>
+            </w:r>
+          </w:p>
+        </w:tc>
+      </w:tr>
+      <w:tr>
+        <w:tc>
+          <w:tcPr>
+            <w:tcBorders>
+              <w:top w:val="single" w:color="CBD5E1" w:sz="1"/>
+              <w:left w:val="single" w:color="CBD5E1" w:sz="1"/>
+              <w:bottom w:val="single" w:color="CBD5E1" w:sz="1"/>
+              <w:right w:val="single" w:color="CBD5E1" w:sz="1"/>
+            </w:tcBorders>
+          </w:tcPr>
+          <w:p>
+            <w:pPr>
+              <w:spacing w:after="40" w:before="40"/>
+            </w:pPr>
+            <w:r>
+              <w:rPr>
+                <w:rFonts w:ascii="Consolas" w:cs="Consolas" w:eastAsia="Consolas" w:hAnsi="Consolas"/>
+                <w:sz w:val="18"/>
+                <w:szCs w:val="18"/>
+                <w:shd w:fill="F1F5F9" w:color="F1F5F9" w:val="solid"/>
+              </w:rPr>
+              <w:t xml:space="preserve">listEntities(wsId, type)</w:t>
+            </w:r>
+          </w:p>
+        </w:tc>
+        <w:tc>
+          <w:tcPr>
+            <w:tcBorders>
+              <w:top w:val="single" w:color="CBD5E1" w:sz="1"/>
+              <w:left w:val="single" w:color="CBD5E1" w:sz="1"/>
+              <w:bottom w:val="single" w:color="CBD5E1" w:sz="1"/>
+              <w:right w:val="single" w:color="CBD5E1" w:sz="1"/>
+            </w:tcBorders>
+          </w:tcPr>
+          <w:p>
+            <w:pPr>
+              <w:spacing w:after="40" w:before="40"/>
+            </w:pPr>
+            <w:r>
+              <w:rPr>
+                <w:rFonts w:ascii="Calibri" w:cs="Calibri" w:eastAsia="Calibri" w:hAnsi="Calibri"/>
+                <w:sz w:val="20"/>
+                <w:szCs w:val="20"/>
+              </w:rPr>
+              <w:t xml:space="preserve">GET /workspaces/:id/entities</w:t>
+            </w:r>
+          </w:p>
+        </w:tc>
+        <w:tc>
+          <w:tcPr>
+            <w:tcBorders>
+              <w:top w:val="single" w:color="CBD5E1" w:sz="1"/>
+              <w:left w:val="single" w:color="CBD5E1" w:sz="1"/>
+              <w:bottom w:val="single" w:color="CBD5E1" w:sz="1"/>
+              <w:right w:val="single" w:color="CBD5E1" w:sz="1"/>
+            </w:tcBorders>
+          </w:tcPr>
+          <w:p>
+            <w:pPr>
+              <w:spacing w:after="40" w:before="40"/>
+            </w:pPr>
+            <w:r>
+              <w:rPr>
+                <w:rFonts w:ascii="Calibri" w:cs="Calibri" w:eastAsia="Calibri" w:hAnsi="Calibri"/>
+                <w:sz w:val="20"/>
+                <w:szCs w:val="20"/>
+              </w:rPr>
+              <w:t xml:space="preserve">Entity cache</w:t>
             </w:r>
           </w:p>
         </w:tc>
@@ -3910,7 +6277,7 @@
                 <w:sz w:val="20"/>
                 <w:szCs w:val="20"/>
               </w:rPr>
-              <w:t xml:space="preserve">cron_run_log</w:t>
+              <w:t xml:space="preserve">GET /cron-runs</w:t>
             </w:r>
           </w:p>
         </w:tc>
@@ -3933,7 +6300,7 @@
                 <w:sz w:val="20"/>
                 <w:szCs w:val="20"/>
               </w:rPr>
-              <w:t xml:space="preserve">Recent cron executions</w:t>
+              <w:t xml:space="preserve">Cron history</w:t>
             </w:r>
           </w:p>
         </w:tc>
@@ -3982,7 +6349,7 @@
                 <w:sz w:val="20"/>
                 <w:szCs w:val="20"/>
               </w:rPr>
-              <w:t xml:space="preserve">rule_audit_log</w:t>
+              <w:t xml:space="preserve">GET /audit-log</w:t>
             </w:r>
           </w:p>
         </w:tc>
@@ -4005,7 +6372,7 @@
                 <w:sz w:val="20"/>
                 <w:szCs w:val="20"/>
               </w:rPr>
-              <w:t xml:space="preserve">All audit entries across workspaces</w:t>
+              <w:t xml:space="preserve">Audit entries (admin)</w:t>
             </w:r>
           </w:p>
         </w:tc>
@@ -4054,7 +6421,7 @@
                 <w:sz w:val="20"/>
                 <w:szCs w:val="20"/>
               </w:rPr>
-              <w:t xml:space="preserve">invitations</w:t>
+              <w:t xml:space="preserve">GET /invitations</w:t>
             </w:r>
           </w:p>
         </w:tc>
@@ -4077,7 +6444,223 @@
                 <w:sz w:val="20"/>
                 <w:szCs w:val="20"/>
               </w:rPr>
-              <w:t xml:space="preserve">All invitation records</w:t>
+              <w:t xml:space="preserve">Invitations (admin)</w:t>
+            </w:r>
+          </w:p>
+        </w:tc>
+      </w:tr>
+      <w:tr>
+        <w:tc>
+          <w:tcPr>
+            <w:tcBorders>
+              <w:top w:val="single" w:color="CBD5E1" w:sz="1"/>
+              <w:left w:val="single" w:color="CBD5E1" w:sz="1"/>
+              <w:bottom w:val="single" w:color="CBD5E1" w:sz="1"/>
+              <w:right w:val="single" w:color="CBD5E1" w:sz="1"/>
+            </w:tcBorders>
+          </w:tcPr>
+          <w:p>
+            <w:pPr>
+              <w:spacing w:after="40" w:before="40"/>
+            </w:pPr>
+            <w:r>
+              <w:rPr>
+                <w:rFonts w:ascii="Consolas" w:cs="Consolas" w:eastAsia="Consolas" w:hAnsi="Consolas"/>
+                <w:sz w:val="18"/>
+                <w:szCs w:val="18"/>
+                <w:shd w:fill="F1F5F9" w:color="F1F5F9" w:val="solid"/>
+              </w:rPr>
+              <w:t xml:space="preserve">listUserProfiles()</w:t>
+            </w:r>
+          </w:p>
+        </w:tc>
+        <w:tc>
+          <w:tcPr>
+            <w:tcBorders>
+              <w:top w:val="single" w:color="CBD5E1" w:sz="1"/>
+              <w:left w:val="single" w:color="CBD5E1" w:sz="1"/>
+              <w:bottom w:val="single" w:color="CBD5E1" w:sz="1"/>
+              <w:right w:val="single" w:color="CBD5E1" w:sz="1"/>
+            </w:tcBorders>
+          </w:tcPr>
+          <w:p>
+            <w:pPr>
+              <w:spacing w:after="40" w:before="40"/>
+            </w:pPr>
+            <w:r>
+              <w:rPr>
+                <w:rFonts w:ascii="Calibri" w:cs="Calibri" w:eastAsia="Calibri" w:hAnsi="Calibri"/>
+                <w:sz w:val="20"/>
+                <w:szCs w:val="20"/>
+              </w:rPr>
+              <w:t xml:space="preserve">GET /user-profiles</w:t>
+            </w:r>
+          </w:p>
+        </w:tc>
+        <w:tc>
+          <w:tcPr>
+            <w:tcBorders>
+              <w:top w:val="single" w:color="CBD5E1" w:sz="1"/>
+              <w:left w:val="single" w:color="CBD5E1" w:sz="1"/>
+              <w:bottom w:val="single" w:color="CBD5E1" w:sz="1"/>
+              <w:right w:val="single" w:color="CBD5E1" w:sz="1"/>
+            </w:tcBorders>
+          </w:tcPr>
+          <w:p>
+            <w:pPr>
+              <w:spacing w:after="40" w:before="40"/>
+            </w:pPr>
+            <w:r>
+              <w:rPr>
+                <w:rFonts w:ascii="Calibri" w:cs="Calibri" w:eastAsia="Calibri" w:hAnsi="Calibri"/>
+                <w:sz w:val="20"/>
+                <w:szCs w:val="20"/>
+              </w:rPr>
+              <w:t xml:space="preserve">User profiles (admin)</w:t>
+            </w:r>
+          </w:p>
+        </w:tc>
+      </w:tr>
+      <w:tr>
+        <w:tc>
+          <w:tcPr>
+            <w:tcBorders>
+              <w:top w:val="single" w:color="CBD5E1" w:sz="1"/>
+              <w:left w:val="single" w:color="CBD5E1" w:sz="1"/>
+              <w:bottom w:val="single" w:color="CBD5E1" w:sz="1"/>
+              <w:right w:val="single" w:color="CBD5E1" w:sz="1"/>
+            </w:tcBorders>
+          </w:tcPr>
+          <w:p>
+            <w:pPr>
+              <w:spacing w:after="40" w:before="40"/>
+            </w:pPr>
+            <w:r>
+              <w:rPr>
+                <w:rFonts w:ascii="Consolas" w:cs="Consolas" w:eastAsia="Consolas" w:hAnsi="Consolas"/>
+                <w:sz w:val="18"/>
+                <w:szCs w:val="18"/>
+                <w:shd w:fill="F1F5F9" w:color="F1F5F9" w:val="solid"/>
+              </w:rPr>
+              <w:t xml:space="preserve">listAdAccountMap()</w:t>
+            </w:r>
+          </w:p>
+        </w:tc>
+        <w:tc>
+          <w:tcPr>
+            <w:tcBorders>
+              <w:top w:val="single" w:color="CBD5E1" w:sz="1"/>
+              <w:left w:val="single" w:color="CBD5E1" w:sz="1"/>
+              <w:bottom w:val="single" w:color="CBD5E1" w:sz="1"/>
+              <w:right w:val="single" w:color="CBD5E1" w:sz="1"/>
+            </w:tcBorders>
+          </w:tcPr>
+          <w:p>
+            <w:pPr>
+              <w:spacing w:after="40" w:before="40"/>
+            </w:pPr>
+            <w:r>
+              <w:rPr>
+                <w:rFonts w:ascii="Calibri" w:cs="Calibri" w:eastAsia="Calibri" w:hAnsi="Calibri"/>
+                <w:sz w:val="20"/>
+                <w:szCs w:val="20"/>
+              </w:rPr>
+              <w:t xml:space="preserve">GET /ad-account-map</w:t>
+            </w:r>
+          </w:p>
+        </w:tc>
+        <w:tc>
+          <w:tcPr>
+            <w:tcBorders>
+              <w:top w:val="single" w:color="CBD5E1" w:sz="1"/>
+              <w:left w:val="single" w:color="CBD5E1" w:sz="1"/>
+              <w:bottom w:val="single" w:color="CBD5E1" w:sz="1"/>
+              <w:right w:val="single" w:color="CBD5E1" w:sz="1"/>
+            </w:tcBorders>
+          </w:tcPr>
+          <w:p>
+            <w:pPr>
+              <w:spacing w:after="40" w:before="40"/>
+            </w:pPr>
+            <w:r>
+              <w:rPr>
+                <w:rFonts w:ascii="Calibri" w:cs="Calibri" w:eastAsia="Calibri" w:hAnsi="Calibri"/>
+                <w:sz w:val="20"/>
+                <w:szCs w:val="20"/>
+              </w:rPr>
+              <w:t xml:space="preserve">Account name lookup</w:t>
+            </w:r>
+          </w:p>
+        </w:tc>
+      </w:tr>
+      <w:tr>
+        <w:tc>
+          <w:tcPr>
+            <w:tcBorders>
+              <w:top w:val="single" w:color="CBD5E1" w:sz="1"/>
+              <w:left w:val="single" w:color="CBD5E1" w:sz="1"/>
+              <w:bottom w:val="single" w:color="CBD5E1" w:sz="1"/>
+              <w:right w:val="single" w:color="CBD5E1" w:sz="1"/>
+            </w:tcBorders>
+          </w:tcPr>
+          <w:p>
+            <w:pPr>
+              <w:spacing w:after="40" w:before="40"/>
+            </w:pPr>
+            <w:r>
+              <w:rPr>
+                <w:rFonts w:ascii="Consolas" w:cs="Consolas" w:eastAsia="Consolas" w:hAnsi="Consolas"/>
+                <w:sz w:val="18"/>
+                <w:szCs w:val="18"/>
+                <w:shd w:fill="F1F5F9" w:color="F1F5F9" w:val="solid"/>
+              </w:rPr>
+              <w:t xml:space="preserve">fetchAdminDashboard()</w:t>
+            </w:r>
+          </w:p>
+        </w:tc>
+        <w:tc>
+          <w:tcPr>
+            <w:tcBorders>
+              <w:top w:val="single" w:color="CBD5E1" w:sz="1"/>
+              <w:left w:val="single" w:color="CBD5E1" w:sz="1"/>
+              <w:bottom w:val="single" w:color="CBD5E1" w:sz="1"/>
+              <w:right w:val="single" w:color="CBD5E1" w:sz="1"/>
+            </w:tcBorders>
+          </w:tcPr>
+          <w:p>
+            <w:pPr>
+              <w:spacing w:after="40" w:before="40"/>
+            </w:pPr>
+            <w:r>
+              <w:rPr>
+                <w:rFonts w:ascii="Calibri" w:cs="Calibri" w:eastAsia="Calibri" w:hAnsi="Calibri"/>
+                <w:sz w:val="20"/>
+                <w:szCs w:val="20"/>
+              </w:rPr>
+              <w:t xml:space="preserve">GET /admin-dashboard</w:t>
+            </w:r>
+          </w:p>
+        </w:tc>
+        <w:tc>
+          <w:tcPr>
+            <w:tcBorders>
+              <w:top w:val="single" w:color="CBD5E1" w:sz="1"/>
+              <w:left w:val="single" w:color="CBD5E1" w:sz="1"/>
+              <w:bottom w:val="single" w:color="CBD5E1" w:sz="1"/>
+              <w:right w:val="single" w:color="CBD5E1" w:sz="1"/>
+            </w:tcBorders>
+          </w:tcPr>
+          <w:p>
+            <w:pPr>
+              <w:spacing w:after="40" w:before="40"/>
+            </w:pPr>
+            <w:r>
+              <w:rPr>
+                <w:rFonts w:ascii="Calibri" w:cs="Calibri" w:eastAsia="Calibri" w:hAnsi="Calibri"/>
+                <w:sz w:val="20"/>
+                <w:szCs w:val="20"/>
+              </w:rPr>
+              <w:t xml:space="preserve">Aggregated admin data</w:t>
             </w:r>
           </w:p>
         </w:tc>

</xml_diff>